<commit_message>
Add AST experiments, manual evaluation and updated report
</commit_message>
<xml_diff>
--- a/reports/report.docx
+++ b/reports/report.docx
@@ -2,6 +2,14 @@
 <file path=word/document.xml><?xml version="1.0" encoding="utf-8"?>
 <w:document xmlns:wpc="http://schemas.microsoft.com/office/word/2010/wordprocessingCanvas" xmlns:cx="http://schemas.microsoft.com/office/drawing/2014/chartex" xmlns:cx1="http://schemas.microsoft.com/office/drawing/2015/9/8/chartex" xmlns:cx2="http://schemas.microsoft.com/office/drawing/2015/10/21/chartex" xmlns:cx3="http://schemas.microsoft.com/office/drawing/2016/5/9/chartex" xmlns:cx4="http://schemas.microsoft.com/office/drawing/2016/5/10/chartex" xmlns:cx5="http://schemas.microsoft.com/office/drawing/2016/5/11/chartex" xmlns:cx6="http://schemas.microsoft.com/office/drawing/2016/5/12/chartex" xmlns:cx7="http://schemas.microsoft.com/office/drawing/2016/5/13/chartex" xmlns:cx8="http://schemas.microsoft.com/office/drawing/2016/5/14/chartex" xmlns:mc="http://schemas.openxmlformats.org/markup-compatibility/2006" xmlns:aink="http://schemas.microsoft.com/office/drawing/2016/ink" xmlns:am3d="http://schemas.microsoft.com/office/drawing/2017/model3d" xmlns:o="urn:schemas-microsoft-com:office:office" xmlns:oel="http://schemas.microsoft.com/office/2019/extlst" xmlns:r="http://schemas.openxmlformats.org/officeDocument/2006/relationships" xmlns:m="http://schemas.openxmlformats.org/officeDocument/2006/math" xmlns:v="urn:schemas-microsoft-com:vml" xmlns:wp14="http://schemas.microsoft.com/office/word/2010/wordprocessingDrawing" xmlns:wp="http://schemas.openxmlformats.org/drawingml/2006/wordprocessingDrawing" xmlns:w10="urn:schemas-microsoft-com:office:word" xmlns:w="http://schemas.openxmlformats.org/wordprocessingml/2006/main" xmlns:w14="http://schemas.microsoft.com/office/word/2010/wordml" xmlns:w15="http://schemas.microsoft.com/office/word/2012/wordml" xmlns:w16cex="http://schemas.microsoft.com/office/word/2018/wordml/cex" xmlns:w16cid="http://schemas.microsoft.com/office/word/2016/wordml/cid" xmlns:w16="http://schemas.microsoft.com/office/word/2018/wordml" xmlns:w16sdtdh="http://schemas.microsoft.com/office/word/2020/wordml/sdtdatahash" xmlns:w16se="http://schemas.microsoft.com/office/word/2015/wordml/symex" xmlns:wpg="http://schemas.microsoft.com/office/word/2010/wordprocessingGroup" xmlns:wpi="http://schemas.microsoft.com/office/word/2010/wordprocessingInk" xmlns:wne="http://schemas.microsoft.com/office/word/2006/wordml" xmlns:wps="http://schemas.microsoft.com/office/word/2010/wordprocessingShape" mc:Ignorable="w14 w15 w16se w16cid w16 w16cex w16sdtdh wp14">
   <w:body>
+    <w:p>
+      <w:pPr>
+        <w:pStyle w:val="Title"/>
+        <w:rPr>
+          <w:lang w:val="ru-RU"/>
+        </w:rPr>
+      </w:pPr>
+    </w:p>
     <w:p>
       <w:pPr>
         <w:pStyle w:val="Title"/>
@@ -2957,7 +2965,15 @@
       </w:r>
       <w:proofErr w:type="spellEnd"/>
       <w:r>
-        <w:t xml:space="preserve"> на test split:</w:t>
+        <w:t xml:space="preserve"> </w:t>
+      </w:r>
+      <w:proofErr w:type="spellStart"/>
+      <w:r>
+        <w:t>на</w:t>
+      </w:r>
+      <w:proofErr w:type="spellEnd"/>
+      <w:r>
+        <w:t xml:space="preserve"> test split:</w:t>
       </w:r>
     </w:p>
     <w:tbl>
@@ -3355,14 +3371,7 @@
           <w:bCs/>
           <w:lang w:val="ru-RU"/>
         </w:rPr>
-        <w:t>Ст</w:t>
-      </w:r>
-      <w:r>
-        <w:rPr>
-          <w:bCs/>
-          <w:lang w:val="ru-RU"/>
-        </w:rPr>
-        <w:t>олбцы</w:t>
+        <w:t>Столбцы</w:t>
       </w:r>
       <w:r>
         <w:rPr>
@@ -4766,16 +4775,16 @@
     </w:p>
     <w:p>
       <w:pPr>
-        <w:pStyle w:val="Heading1"/>
-        <w:rPr>
-          <w:lang w:val="ru-RU"/>
-        </w:rPr>
-      </w:pPr>
-      <w:r>
-        <w:rPr>
-          <w:lang w:val="ru-RU"/>
-        </w:rPr>
-        <w:t>11. Вывод</w:t>
+        <w:pStyle w:val="Heading2"/>
+        <w:rPr>
+          <w:lang w:val="ru-RU"/>
+        </w:rPr>
+      </w:pPr>
+      <w:r>
+        <w:rPr>
+          <w:lang w:val="ru-RU"/>
+        </w:rPr>
+        <w:t>10.1 Реализованные изменения</w:t>
       </w:r>
     </w:p>
     <w:p>
@@ -4788,82 +4797,35 @@
         <w:rPr>
           <w:lang w:val="ru-RU"/>
         </w:rPr>
-        <w:t xml:space="preserve">В проекте реализован полный </w:t>
-      </w:r>
-      <w:r>
-        <w:t>retrieval</w:t>
-      </w:r>
-      <w:r>
-        <w:rPr>
-          <w:lang w:val="ru-RU"/>
-        </w:rPr>
-        <w:t xml:space="preserve"> </w:t>
-      </w:r>
-      <w:r>
-        <w:t>pipeline</w:t>
-      </w:r>
-      <w:r>
-        <w:rPr>
-          <w:lang w:val="ru-RU"/>
-        </w:rPr>
-        <w:t xml:space="preserve"> для задачи подбора музыки к видео: загрузка данных, фильтрация видео, извлечение видео и аудио</w:t>
-      </w:r>
-      <w:r>
-        <w:rPr>
-          <w:lang w:val="ru-RU"/>
-        </w:rPr>
-        <w:t xml:space="preserve"> </w:t>
-      </w:r>
-      <w:r>
-        <w:rPr>
-          <w:lang w:val="ru-RU"/>
-        </w:rPr>
-        <w:t xml:space="preserve">признаков, обучение </w:t>
-      </w:r>
-      <w:r>
-        <w:t>two</w:t>
-      </w:r>
-      <w:r>
-        <w:rPr>
-          <w:lang w:val="ru-RU"/>
-        </w:rPr>
-        <w:t>-</w:t>
-      </w:r>
-      <w:r>
-        <w:t>tower</w:t>
-      </w:r>
-      <w:r>
-        <w:rPr>
-          <w:lang w:val="ru-RU"/>
-        </w:rPr>
-        <w:t xml:space="preserve"> модели, оценка через </w:t>
-      </w:r>
-      <w:r>
-        <w:t>retrieval</w:t>
-      </w:r>
-      <w:r>
-        <w:rPr>
-          <w:lang w:val="ru-RU"/>
-        </w:rPr>
-        <w:t xml:space="preserve">-метрики и сравнение с </w:t>
-      </w:r>
-      <w:r>
-        <w:t>random</w:t>
-      </w:r>
-      <w:r>
-        <w:rPr>
-          <w:lang w:val="ru-RU"/>
-        </w:rPr>
-        <w:t xml:space="preserve"> </w:t>
-      </w:r>
-      <w:r>
-        <w:t>baseline</w:t>
-      </w:r>
-      <w:r>
-        <w:rPr>
-          <w:lang w:val="ru-RU"/>
-        </w:rPr>
-        <w:t>.</w:t>
+        <w:t xml:space="preserve">Подготовлен дополнительный </w:t>
+      </w:r>
+      <w:proofErr w:type="spellStart"/>
+      <w:r>
+        <w:rPr>
+          <w:lang w:val="ru-RU"/>
+        </w:rPr>
+        <w:t>пайплайн</w:t>
+      </w:r>
+      <w:proofErr w:type="spellEnd"/>
+      <w:r>
+        <w:rPr>
+          <w:lang w:val="ru-RU"/>
+        </w:rPr>
+        <w:t xml:space="preserve"> для проверки качества данных и </w:t>
+      </w:r>
+      <w:proofErr w:type="spellStart"/>
+      <w:r>
+        <w:rPr>
+          <w:lang w:val="ru-RU"/>
+        </w:rPr>
+        <w:t>аудиопризнаков</w:t>
+      </w:r>
+      <w:proofErr w:type="spellEnd"/>
+      <w:r>
+        <w:rPr>
+          <w:lang w:val="ru-RU"/>
+        </w:rPr>
+        <w:t>. Исторические результаты в разделах 7–8 относятся к исходной модели; новое обучение завершено, его результаты приведены ниже.</w:t>
       </w:r>
     </w:p>
     <w:p>
@@ -4876,39 +4838,86 @@
         <w:rPr>
           <w:lang w:val="ru-RU"/>
         </w:rPr>
-        <w:t xml:space="preserve">Текущий эксперимент показывает, что даже простая модель начинает ранжировать правильные пары лучше случайного выбора по </w:t>
-      </w:r>
-      <w:r>
-        <w:t>Hit</w:t>
-      </w:r>
-      <w:r>
-        <w:rPr>
-          <w:lang w:val="ru-RU"/>
-        </w:rPr>
-        <w:t xml:space="preserve">@5 и </w:t>
-      </w:r>
-      <w:r>
-        <w:t>MRR</w:t>
-      </w:r>
-      <w:r>
-        <w:rPr>
-          <w:lang w:val="ru-RU"/>
-        </w:rPr>
-        <w:t xml:space="preserve">. Основные причины — небольшой объём данных, простые </w:t>
+        <w:t xml:space="preserve">Вместо одних </w:t>
       </w:r>
       <w:proofErr w:type="spellStart"/>
       <w:r>
-        <w:rPr>
-          <w:lang w:val="ru-RU"/>
-        </w:rPr>
-        <w:t>аудиопризнаки</w:t>
+        <w:t>mel</w:t>
       </w:r>
       <w:proofErr w:type="spellEnd"/>
       <w:r>
         <w:rPr>
           <w:lang w:val="ru-RU"/>
         </w:rPr>
-        <w:t xml:space="preserve"> и отсутствие явного моделирования временной структуры видео и музыки.</w:t>
+        <w:t xml:space="preserve">-статистик добавлен замороженный </w:t>
+      </w:r>
+      <w:r>
+        <w:t>AST</w:t>
+      </w:r>
+      <w:r>
+        <w:rPr>
+          <w:lang w:val="ru-RU"/>
+        </w:rPr>
+        <w:t xml:space="preserve">, </w:t>
+      </w:r>
+      <w:proofErr w:type="spellStart"/>
+      <w:r>
+        <w:rPr>
+          <w:lang w:val="ru-RU"/>
+        </w:rPr>
+        <w:t>предобученный</w:t>
+      </w:r>
+      <w:proofErr w:type="spellEnd"/>
+      <w:r>
+        <w:rPr>
+          <w:lang w:val="ru-RU"/>
+        </w:rPr>
+        <w:t xml:space="preserve"> на </w:t>
+      </w:r>
+      <w:proofErr w:type="spellStart"/>
+      <w:r>
+        <w:t>AudioSet</w:t>
+      </w:r>
+      <w:proofErr w:type="spellEnd"/>
+      <w:r>
+        <w:rPr>
+          <w:lang w:val="ru-RU"/>
+        </w:rPr>
+        <w:t xml:space="preserve">. Его 768-мерные признаки усредняются по трём </w:t>
+      </w:r>
+      <w:proofErr w:type="spellStart"/>
+      <w:r>
+        <w:rPr>
+          <w:lang w:val="ru-RU"/>
+        </w:rPr>
+        <w:t>аудиоокнам</w:t>
+      </w:r>
+      <w:proofErr w:type="spellEnd"/>
+      <w:r>
+        <w:rPr>
+          <w:lang w:val="ru-RU"/>
+        </w:rPr>
+        <w:t xml:space="preserve"> длительностью до 10 секунд. </w:t>
+      </w:r>
+      <w:proofErr w:type="spellStart"/>
+      <w:r>
+        <w:t>ResNet</w:t>
+      </w:r>
+      <w:proofErr w:type="spellEnd"/>
+      <w:r>
+        <w:rPr>
+          <w:lang w:val="ru-RU"/>
+        </w:rPr>
+        <w:t xml:space="preserve">50 и усреднение 16 кадров сохранены. </w:t>
+      </w:r>
+      <w:r>
+        <w:t>AST</w:t>
+      </w:r>
+      <w:r>
+        <w:rPr>
+          <w:lang w:val="ru-RU"/>
+        </w:rPr>
+        <w:t xml:space="preserve"> описывает звуковые события и потенциально лучше различает музыкальные и речевые компоненты; эстетическую совместимость с видео он сам по себе не гарантирует.</w:t>
       </w:r>
     </w:p>
     <w:p>
@@ -4921,39 +4930,34 @@
         <w:rPr>
           <w:lang w:val="ru-RU"/>
         </w:rPr>
-        <w:t xml:space="preserve">Эксперимент на большей </w:t>
-      </w:r>
-      <w:proofErr w:type="spellStart"/>
-      <w:r>
-        <w:rPr>
-          <w:lang w:val="ru-RU"/>
-        </w:rPr>
-        <w:t>подвыборке</w:t>
-      </w:r>
-      <w:proofErr w:type="spellEnd"/>
-      <w:r>
-        <w:rPr>
-          <w:lang w:val="ru-RU"/>
-        </w:rPr>
-        <w:t xml:space="preserve"> подтвердил, что модель обучается и показывает результат выше </w:t>
-      </w:r>
-      <w:r>
-        <w:t>random</w:t>
-      </w:r>
-      <w:r>
-        <w:rPr>
-          <w:lang w:val="ru-RU"/>
-        </w:rPr>
-        <w:t xml:space="preserve"> </w:t>
-      </w:r>
-      <w:r>
-        <w:t>baseline</w:t>
-      </w:r>
-      <w:r>
-        <w:rPr>
-          <w:lang w:val="ru-RU"/>
-        </w:rPr>
-        <w:t>, но качество остаётся ограниченным. Дополнительная попытка усложнить башни не дала улучшения на тех же признаках, поэтому в проекте оставлена более простая архитектура.</w:t>
+        <w:t xml:space="preserve">Автоматический фильтр проверяет наличие музыки и речи по выходам </w:t>
+      </w:r>
+      <w:r>
+        <w:t>AST</w:t>
+      </w:r>
+      <w:r>
+        <w:rPr>
+          <w:lang w:val="ru-RU"/>
+        </w:rPr>
+        <w:t xml:space="preserve">. Порог </w:t>
+      </w:r>
+      <w:r>
+        <w:t>Music</w:t>
+      </w:r>
+      <w:r>
+        <w:rPr>
+          <w:lang w:val="ru-RU"/>
+        </w:rPr>
+        <w:t xml:space="preserve"> — 0.30 как минимум в двух из трёх окон; средний </w:t>
+      </w:r>
+      <w:r>
+        <w:t>Speech</w:t>
+      </w:r>
+      <w:r>
+        <w:rPr>
+          <w:lang w:val="ru-RU"/>
+        </w:rPr>
+        <w:t xml:space="preserve"> не выше 0.30. Дополнительно учитываются тишина и явные указания на конфликт в текстовой аннотации. Эти правила являются слабой разметкой. Они требуют ручного аудита, могут исключать вокальную музыку и не устраняют все посторонние звуки.</w:t>
       </w:r>
     </w:p>
     <w:p>
@@ -4962,6 +4966,3148 @@
           <w:lang w:val="ru-RU"/>
         </w:rPr>
       </w:pPr>
+      <w:r>
+        <w:rPr>
+          <w:lang w:val="ru-RU"/>
+        </w:rPr>
+        <w:t xml:space="preserve">Разбиение закреплено по </w:t>
+      </w:r>
+      <w:r>
+        <w:t>YouTube</w:t>
+      </w:r>
+      <w:r>
+        <w:rPr>
+          <w:lang w:val="ru-RU"/>
+        </w:rPr>
+        <w:t xml:space="preserve"> </w:t>
+      </w:r>
+      <w:r>
+        <w:t>ID</w:t>
+      </w:r>
+      <w:r>
+        <w:rPr>
+          <w:lang w:val="ru-RU"/>
+        </w:rPr>
+        <w:t xml:space="preserve">; повторные </w:t>
+      </w:r>
+      <w:r>
+        <w:t>ID</w:t>
+      </w:r>
+      <w:r>
+        <w:rPr>
+          <w:lang w:val="ru-RU"/>
+        </w:rPr>
+        <w:t xml:space="preserve"> и точные копии файлов исключаются. Стандартизация входов обучается только на </w:t>
+      </w:r>
+      <w:r>
+        <w:t>train</w:t>
+      </w:r>
+      <w:r>
+        <w:rPr>
+          <w:lang w:val="ru-RU"/>
+        </w:rPr>
+        <w:t xml:space="preserve">. Для небольшой выборки используются линейные проекции в 64-мерное пространство, </w:t>
+      </w:r>
+      <w:r>
+        <w:t>L</w:t>
+      </w:r>
+      <w:r>
+        <w:rPr>
+          <w:lang w:val="ru-RU"/>
+        </w:rPr>
+        <w:t xml:space="preserve">2-нормализация и прежняя симметричная </w:t>
+      </w:r>
+      <w:r>
+        <w:t>contrastive</w:t>
+      </w:r>
+      <w:r>
+        <w:rPr>
+          <w:lang w:val="ru-RU"/>
+        </w:rPr>
+        <w:t xml:space="preserve"> </w:t>
+      </w:r>
+      <w:r>
+        <w:t>loss</w:t>
+      </w:r>
+      <w:r>
+        <w:rPr>
+          <w:lang w:val="ru-RU"/>
+        </w:rPr>
+        <w:t>. Это ограничивает число обучаемых параметров по сравнению с многослойными башнями.</w:t>
+      </w:r>
+    </w:p>
+    <w:p>
+      <w:pPr>
+        <w:rPr>
+          <w:lang w:val="ru-RU"/>
+        </w:rPr>
+      </w:pPr>
+      <w:r>
+        <w:rPr>
+          <w:lang w:val="ru-RU"/>
+        </w:rPr>
+        <w:lastRenderedPageBreak/>
+        <w:t xml:space="preserve">Заданы пять опытов: </w:t>
+      </w:r>
+      <w:proofErr w:type="spellStart"/>
+      <w:r>
+        <w:t>mel</w:t>
+      </w:r>
+      <w:proofErr w:type="spellEnd"/>
+      <w:r>
+        <w:rPr>
+          <w:lang w:val="ru-RU"/>
+        </w:rPr>
+        <w:t xml:space="preserve"> без фильтра; </w:t>
+      </w:r>
+      <w:r>
+        <w:t>AST</w:t>
+      </w:r>
+      <w:r>
+        <w:rPr>
+          <w:lang w:val="ru-RU"/>
+        </w:rPr>
+        <w:t xml:space="preserve"> без фильтра; </w:t>
+      </w:r>
+      <w:r>
+        <w:t>AST</w:t>
+      </w:r>
+      <w:r>
+        <w:rPr>
+          <w:lang w:val="ru-RU"/>
+        </w:rPr>
+        <w:t xml:space="preserve"> с </w:t>
+      </w:r>
+      <w:proofErr w:type="spellStart"/>
+      <w:r>
+        <w:rPr>
+          <w:lang w:val="ru-RU"/>
+        </w:rPr>
+        <w:t>аудиофильтром</w:t>
+      </w:r>
+      <w:proofErr w:type="spellEnd"/>
+      <w:r>
+        <w:rPr>
+          <w:lang w:val="ru-RU"/>
+        </w:rPr>
+        <w:t xml:space="preserve">; </w:t>
+      </w:r>
+      <w:r>
+        <w:t>AST</w:t>
+      </w:r>
+      <w:r>
+        <w:rPr>
+          <w:lang w:val="ru-RU"/>
+        </w:rPr>
+        <w:t xml:space="preserve"> с </w:t>
+      </w:r>
+      <w:proofErr w:type="spellStart"/>
+      <w:r>
+        <w:rPr>
+          <w:lang w:val="ru-RU"/>
+        </w:rPr>
+        <w:t>аудиофильтром</w:t>
+      </w:r>
+      <w:proofErr w:type="spellEnd"/>
+      <w:r>
+        <w:rPr>
+          <w:lang w:val="ru-RU"/>
+        </w:rPr>
+        <w:t xml:space="preserve"> и проверкой аннотаций; </w:t>
+      </w:r>
+      <w:r>
+        <w:t>AST</w:t>
+      </w:r>
+      <w:r>
+        <w:rPr>
+          <w:lang w:val="ru-RU"/>
+        </w:rPr>
+        <w:t xml:space="preserve"> на случайной </w:t>
+      </w:r>
+      <w:proofErr w:type="spellStart"/>
+      <w:r>
+        <w:rPr>
+          <w:lang w:val="ru-RU"/>
+        </w:rPr>
+        <w:t>подвыборке</w:t>
+      </w:r>
+      <w:proofErr w:type="spellEnd"/>
+      <w:r>
+        <w:rPr>
+          <w:lang w:val="ru-RU"/>
+        </w:rPr>
+        <w:t xml:space="preserve"> того же размера, что после полной фильтрации. Последний вариант нужен, чтобы отличить эффект очистки от эффекта уменьшения </w:t>
+      </w:r>
+      <w:r>
+        <w:t>train</w:t>
+      </w:r>
+      <w:r>
+        <w:rPr>
+          <w:lang w:val="ru-RU"/>
+        </w:rPr>
+        <w:t xml:space="preserve">. Для всех вариантов используется одна музыкальная галерея </w:t>
+      </w:r>
+      <w:r>
+        <w:t>validation</w:t>
+      </w:r>
+      <w:r>
+        <w:rPr>
+          <w:lang w:val="ru-RU"/>
+        </w:rPr>
+        <w:t>/</w:t>
+      </w:r>
+      <w:r>
+        <w:t>test</w:t>
+      </w:r>
+      <w:r>
+        <w:rPr>
+          <w:lang w:val="ru-RU"/>
+        </w:rPr>
+        <w:t xml:space="preserve"> и три </w:t>
+      </w:r>
+      <w:r>
+        <w:t>seed</w:t>
+      </w:r>
+      <w:r>
+        <w:rPr>
+          <w:lang w:val="ru-RU"/>
+        </w:rPr>
+        <w:t xml:space="preserve"> — 42, 43, 44. </w:t>
+      </w:r>
+      <w:r>
+        <w:t>Модель выбирается по среднему validation MRR.</w:t>
+      </w:r>
+    </w:p>
+    <w:p>
+      <w:pPr>
+        <w:rPr>
+          <w:lang w:val="ru-RU"/>
+        </w:rPr>
+      </w:pPr>
+      <w:r>
+        <w:rPr>
+          <w:noProof/>
+        </w:rPr>
+        <w:drawing>
+          <wp:inline distT="0" distB="0" distL="0" distR="0">
+            <wp:extent cx="5669280" cy="1965350"/>
+            <wp:effectExtent l="0" t="0" r="0" b="0"/>
+            <wp:docPr id="4" name="Picture 4"/>
+            <wp:cNvGraphicFramePr>
+              <a:graphicFrameLocks xmlns:a="http://schemas.openxmlformats.org/drawingml/2006/main" noChangeAspect="1"/>
+            </wp:cNvGraphicFramePr>
+            <a:graphic xmlns:a="http://schemas.openxmlformats.org/drawingml/2006/main">
+              <a:graphicData uri="http://schemas.openxmlformats.org/drawingml/2006/picture">
+                <pic:pic xmlns:pic="http://schemas.openxmlformats.org/drawingml/2006/picture">
+                  <pic:nvPicPr>
+                    <pic:cNvPr id="0" name="pipeline.png"/>
+                    <pic:cNvPicPr/>
+                  </pic:nvPicPr>
+                  <pic:blipFill>
+                    <a:blip r:embed="rId9"/>
+                    <a:stretch>
+                      <a:fillRect/>
+                    </a:stretch>
+                  </pic:blipFill>
+                  <pic:spPr>
+                    <a:xfrm>
+                      <a:off x="0" y="0"/>
+                      <a:ext cx="5669280" cy="1965350"/>
+                    </a:xfrm>
+                    <a:prstGeom prst="rect">
+                      <a:avLst/>
+                    </a:prstGeom>
+                  </pic:spPr>
+                </pic:pic>
+              </a:graphicData>
+            </a:graphic>
+          </wp:inline>
+        </w:drawing>
+      </w:r>
+    </w:p>
+    <w:p>
+      <w:pPr>
+        <w:rPr>
+          <w:lang w:val="ru-RU"/>
+        </w:rPr>
+      </w:pPr>
+    </w:p>
+    <w:p>
+      <w:pPr>
+        <w:rPr>
+          <w:lang w:val="ru-RU"/>
+        </w:rPr>
+      </w:pPr>
+      <w:r>
+        <w:rPr>
+          <w:lang w:val="ru-RU"/>
+        </w:rPr>
+        <w:t xml:space="preserve">Схема дополнительного </w:t>
+      </w:r>
+      <w:proofErr w:type="spellStart"/>
+      <w:r>
+        <w:rPr>
+          <w:lang w:val="ru-RU"/>
+        </w:rPr>
+        <w:t>пайплайна</w:t>
+      </w:r>
+      <w:proofErr w:type="spellEnd"/>
+      <w:r>
+        <w:rPr>
+          <w:lang w:val="ru-RU"/>
+        </w:rPr>
+        <w:t xml:space="preserve">. </w:t>
+      </w:r>
+    </w:p>
+    <w:p>
+      <w:pPr>
+        <w:rPr>
+          <w:lang w:val="ru-RU"/>
+        </w:rPr>
+      </w:pPr>
+      <w:r>
+        <w:rPr>
+          <w:lang w:val="ru-RU"/>
+        </w:rPr>
+        <w:t xml:space="preserve">Ручная оценка проверяет уместность музыки, а </w:t>
+      </w:r>
+      <w:r>
+        <w:t>retrieval</w:t>
+      </w:r>
+      <w:r>
+        <w:rPr>
+          <w:lang w:val="ru-RU"/>
+        </w:rPr>
+        <w:t>-метрики — поиск исходной пары.</w:t>
+      </w:r>
+    </w:p>
+    <w:p>
+      <w:pPr>
+        <w:rPr>
+          <w:lang w:val="ru-RU"/>
+        </w:rPr>
+      </w:pPr>
+      <w:r>
+        <w:t>Hit</w:t>
+      </w:r>
+      <w:r>
+        <w:rPr>
+          <w:lang w:val="ru-RU"/>
+        </w:rPr>
+        <w:t xml:space="preserve">@1, </w:t>
+      </w:r>
+      <w:r>
+        <w:t>Hit</w:t>
+      </w:r>
+      <w:r>
+        <w:rPr>
+          <w:lang w:val="ru-RU"/>
+        </w:rPr>
+        <w:t xml:space="preserve">@5 и </w:t>
+      </w:r>
+      <w:r>
+        <w:t>MRR</w:t>
+      </w:r>
+      <w:r>
+        <w:rPr>
+          <w:lang w:val="ru-RU"/>
+        </w:rPr>
+        <w:t xml:space="preserve"> сохраняются как проверка восстановления исходной аудиодорожки. У одного видео могут быть несколько подходящих треков, поэтому низкий ранг исходной дорожки не всегда означает плохую рекомендацию. Для оценки совместимости </w:t>
+      </w:r>
+      <w:r>
+        <w:rPr>
+          <w:lang w:val="ru-RU"/>
+        </w:rPr>
+        <w:t xml:space="preserve">видео и аудио-кандидатов была создана </w:t>
+      </w:r>
+      <w:r>
+        <w:rPr>
+          <w:lang w:val="ru-RU"/>
+        </w:rPr>
+        <w:t xml:space="preserve">страница прослушивания: </w:t>
+      </w:r>
+      <w:r>
+        <w:rPr>
+          <w:lang w:val="ru-RU"/>
+        </w:rPr>
+        <w:t xml:space="preserve">для нескольких видео из выборки мною вручную оценивались </w:t>
+      </w:r>
+      <w:r>
+        <w:rPr>
+          <w:lang w:val="ru-RU"/>
+        </w:rPr>
+        <w:t xml:space="preserve">кандидаты модели, </w:t>
+      </w:r>
+      <w:r>
+        <w:t>baseline</w:t>
+      </w:r>
+      <w:r>
+        <w:rPr>
+          <w:lang w:val="ru-RU"/>
+        </w:rPr>
+        <w:t xml:space="preserve"> и случайного выбора. </w:t>
+      </w:r>
+      <w:r>
+        <w:rPr>
+          <w:lang w:val="ru-RU"/>
+        </w:rPr>
+        <w:t xml:space="preserve">Причем на момент </w:t>
+      </w:r>
+      <w:proofErr w:type="gramStart"/>
+      <w:r>
+        <w:rPr>
+          <w:lang w:val="ru-RU"/>
+        </w:rPr>
+        <w:t>оценки ,</w:t>
+      </w:r>
+      <w:proofErr w:type="gramEnd"/>
+      <w:r>
+        <w:rPr>
+          <w:lang w:val="ru-RU"/>
+        </w:rPr>
+        <w:t xml:space="preserve"> я не видел, откуда был взят аудио-кандидат, это сделало оценку честной. Для каждой пары я ставил оценку совместимости и словесное описание соответствия/несоответствия.</w:t>
+      </w:r>
+    </w:p>
+    <w:p>
+      <w:pPr>
+        <w:rPr>
+          <w:lang w:val="ru-RU"/>
+        </w:rPr>
+      </w:pPr>
+      <w:r>
+        <w:rPr>
+          <w:lang w:val="ru-RU"/>
+        </w:rPr>
+        <w:t xml:space="preserve">Из 1200 запрошенных ссылок скачаны 380 уникальных видео. Разбиение: 272 </w:t>
+      </w:r>
+      <w:r>
+        <w:t>train</w:t>
+      </w:r>
+      <w:r>
+        <w:rPr>
+          <w:lang w:val="ru-RU"/>
+        </w:rPr>
+        <w:t xml:space="preserve">, 55 </w:t>
+      </w:r>
+      <w:r>
+        <w:t>validation</w:t>
+      </w:r>
+      <w:r>
+        <w:rPr>
+          <w:lang w:val="ru-RU"/>
+        </w:rPr>
+        <w:t xml:space="preserve">, 53 </w:t>
+      </w:r>
+      <w:r>
+        <w:t>test</w:t>
+      </w:r>
+      <w:r>
+        <w:rPr>
+          <w:lang w:val="ru-RU"/>
+        </w:rPr>
+        <w:t xml:space="preserve">. Для всех видео признаки получены без ошибок. Недоступные ссылки ограничивают выборку: полученные данные могут отличаться от полного </w:t>
+      </w:r>
+      <w:proofErr w:type="spellStart"/>
+      <w:r>
+        <w:rPr>
+          <w:lang w:val="ru-RU"/>
+        </w:rPr>
+        <w:t>датасета</w:t>
+      </w:r>
+      <w:proofErr w:type="spellEnd"/>
+      <w:r>
+        <w:rPr>
+          <w:lang w:val="ru-RU"/>
+        </w:rPr>
+        <w:t>.</w:t>
+      </w:r>
+    </w:p>
+    <w:p>
+      <w:pPr>
+        <w:rPr>
+          <w:lang w:val="ru-RU"/>
+        </w:rPr>
+      </w:pPr>
+      <w:r>
+        <w:rPr>
+          <w:lang w:val="ru-RU"/>
+        </w:rPr>
+        <w:t xml:space="preserve">На </w:t>
+      </w:r>
+      <w:r>
+        <w:t>train</w:t>
+      </w:r>
+      <w:r>
+        <w:rPr>
+          <w:lang w:val="ru-RU"/>
+        </w:rPr>
+        <w:t xml:space="preserve"> наличие музыки определено у 264 пар. После ограничения речи остаётся 184 пары, после проверки аннотаций — 98. Основная оценка проводится на общей музыкальной галерее: 55 </w:t>
+      </w:r>
+      <w:r>
+        <w:t>validation</w:t>
+      </w:r>
+      <w:r>
+        <w:rPr>
+          <w:lang w:val="ru-RU"/>
+        </w:rPr>
+        <w:t xml:space="preserve"> и 49 </w:t>
+      </w:r>
+      <w:r>
+        <w:t>test</w:t>
+      </w:r>
+      <w:r>
+        <w:rPr>
+          <w:lang w:val="ru-RU"/>
+        </w:rPr>
+        <w:t xml:space="preserve">. Фильтры меняют только состав </w:t>
+      </w:r>
+      <w:r>
+        <w:t>train</w:t>
+      </w:r>
+      <w:r>
+        <w:rPr>
+          <w:lang w:val="ru-RU"/>
+        </w:rPr>
+        <w:t xml:space="preserve"> в </w:t>
+      </w:r>
+      <w:r>
+        <w:rPr>
+          <w:lang w:val="ru-RU"/>
+        </w:rPr>
+        <w:lastRenderedPageBreak/>
+        <w:t xml:space="preserve">сравнении методов; дополнительная оценка на всех 53 тестовых парах сохранена в </w:t>
+      </w:r>
+      <w:r>
+        <w:t>test</w:t>
+      </w:r>
+      <w:r>
+        <w:rPr>
+          <w:lang w:val="ru-RU"/>
+        </w:rPr>
+        <w:t>_</w:t>
+      </w:r>
+      <w:r>
+        <w:t>metrics</w:t>
+      </w:r>
+      <w:r>
+        <w:rPr>
+          <w:lang w:val="ru-RU"/>
+        </w:rPr>
+        <w:t>.</w:t>
+      </w:r>
+      <w:r>
+        <w:t>csv</w:t>
+      </w:r>
+      <w:r>
+        <w:rPr>
+          <w:lang w:val="ru-RU"/>
+        </w:rPr>
+        <w:t>.</w:t>
+      </w:r>
+    </w:p>
+    <w:p>
+      <w:pPr>
+        <w:rPr>
+          <w:lang w:val="ru-RU"/>
+        </w:rPr>
+      </w:pPr>
+      <w:r>
+        <w:rPr>
+          <w:lang w:val="ru-RU"/>
+        </w:rPr>
+        <w:t xml:space="preserve">Средние результаты на </w:t>
+      </w:r>
+      <w:r>
+        <w:t>test</w:t>
+      </w:r>
+      <w:r>
+        <w:rPr>
+          <w:lang w:val="ru-RU"/>
+        </w:rPr>
+        <w:t xml:space="preserve"> по трём </w:t>
+      </w:r>
+      <w:r>
+        <w:t>seed</w:t>
+      </w:r>
+      <w:r>
+        <w:rPr>
+          <w:lang w:val="ru-RU"/>
+        </w:rPr>
+        <w:t xml:space="preserve"> приведены в таблице. </w:t>
+      </w:r>
+      <w:r>
+        <w:t>Hit</w:t>
+      </w:r>
+      <w:r>
+        <w:rPr>
+          <w:lang w:val="ru-RU"/>
+        </w:rPr>
+        <w:t>@</w:t>
+      </w:r>
+      <w:r>
+        <w:t>k</w:t>
+      </w:r>
+      <w:r>
+        <w:rPr>
+          <w:lang w:val="ru-RU"/>
+        </w:rPr>
+        <w:t xml:space="preserve"> и </w:t>
+      </w:r>
+      <w:r>
+        <w:t>MRR</w:t>
+      </w:r>
+      <w:r>
+        <w:rPr>
+          <w:lang w:val="ru-RU"/>
+        </w:rPr>
+        <w:t xml:space="preserve"> указаны в долях. </w:t>
+      </w:r>
+      <w:r>
+        <w:t>Ridge имеет один детерминированный запуск.</w:t>
+      </w:r>
+    </w:p>
+    <w:tbl>
+      <w:tblPr>
+        <w:tblStyle w:val="LightGrid-Accent1"/>
+        <w:tblW w:w="0" w:type="auto"/>
+        <w:tblLook w:val="04A0" w:firstRow="1" w:lastRow="0" w:firstColumn="1" w:lastColumn="0" w:noHBand="0" w:noVBand="1"/>
+      </w:tblPr>
+      <w:tblGrid>
+        <w:gridCol w:w="1728"/>
+        <w:gridCol w:w="1728"/>
+        <w:gridCol w:w="1728"/>
+        <w:gridCol w:w="1728"/>
+        <w:gridCol w:w="1728"/>
+      </w:tblGrid>
+      <w:tr>
+        <w:trPr>
+          <w:cnfStyle w:val="100000000000" w:firstRow="1" w:lastRow="0" w:firstColumn="0" w:lastColumn="0" w:oddVBand="0" w:evenVBand="0" w:oddHBand="0" w:evenHBand="0" w:firstRowFirstColumn="0" w:firstRowLastColumn="0" w:lastRowFirstColumn="0" w:lastRowLastColumn="0"/>
+        </w:trPr>
+        <w:tc>
+          <w:tcPr>
+            <w:cnfStyle w:val="001000000000" w:firstRow="0" w:lastRow="0" w:firstColumn="1" w:lastColumn="0" w:oddVBand="0" w:evenVBand="0" w:oddHBand="0" w:evenHBand="0" w:firstRowFirstColumn="0" w:firstRowLastColumn="0" w:lastRowFirstColumn="0" w:lastRowLastColumn="0"/>
+            <w:tcW w:w="1728" w:type="dxa"/>
+          </w:tcPr>
+          <w:p>
+            <w:r>
+              <w:t>Метод</w:t>
+            </w:r>
+          </w:p>
+        </w:tc>
+        <w:tc>
+          <w:tcPr>
+            <w:tcW w:w="1728" w:type="dxa"/>
+          </w:tcPr>
+          <w:p>
+            <w:pPr>
+              <w:cnfStyle w:val="100000000000" w:firstRow="1" w:lastRow="0" w:firstColumn="0" w:lastColumn="0" w:oddVBand="0" w:evenVBand="0" w:oddHBand="0" w:evenHBand="0" w:firstRowFirstColumn="0" w:firstRowLastColumn="0" w:lastRowFirstColumn="0" w:lastRowLastColumn="0"/>
+            </w:pPr>
+            <w:r>
+              <w:t>Train</w:t>
+            </w:r>
+          </w:p>
+        </w:tc>
+        <w:tc>
+          <w:tcPr>
+            <w:tcW w:w="1728" w:type="dxa"/>
+          </w:tcPr>
+          <w:p>
+            <w:pPr>
+              <w:cnfStyle w:val="100000000000" w:firstRow="1" w:lastRow="0" w:firstColumn="0" w:lastColumn="0" w:oddVBand="0" w:evenVBand="0" w:oddHBand="0" w:evenHBand="0" w:firstRowFirstColumn="0" w:firstRowLastColumn="0" w:lastRowFirstColumn="0" w:lastRowLastColumn="0"/>
+            </w:pPr>
+            <w:r>
+              <w:t>Hit@1</w:t>
+            </w:r>
+          </w:p>
+        </w:tc>
+        <w:tc>
+          <w:tcPr>
+            <w:tcW w:w="1728" w:type="dxa"/>
+          </w:tcPr>
+          <w:p>
+            <w:pPr>
+              <w:cnfStyle w:val="100000000000" w:firstRow="1" w:lastRow="0" w:firstColumn="0" w:lastColumn="0" w:oddVBand="0" w:evenVBand="0" w:oddHBand="0" w:evenHBand="0" w:firstRowFirstColumn="0" w:firstRowLastColumn="0" w:lastRowFirstColumn="0" w:lastRowLastColumn="0"/>
+            </w:pPr>
+            <w:r>
+              <w:t>Hit@5</w:t>
+            </w:r>
+          </w:p>
+        </w:tc>
+        <w:tc>
+          <w:tcPr>
+            <w:tcW w:w="1728" w:type="dxa"/>
+          </w:tcPr>
+          <w:p>
+            <w:pPr>
+              <w:cnfStyle w:val="100000000000" w:firstRow="1" w:lastRow="0" w:firstColumn="0" w:lastColumn="0" w:oddVBand="0" w:evenVBand="0" w:oddHBand="0" w:evenHBand="0" w:firstRowFirstColumn="0" w:firstRowLastColumn="0" w:lastRowFirstColumn="0" w:lastRowLastColumn="0"/>
+            </w:pPr>
+            <w:r>
+              <w:t>MRR</w:t>
+            </w:r>
+          </w:p>
+        </w:tc>
+      </w:tr>
+      <w:tr>
+        <w:trPr>
+          <w:cnfStyle w:val="000000100000" w:firstRow="0" w:lastRow="0" w:firstColumn="0" w:lastColumn="0" w:oddVBand="0" w:evenVBand="0" w:oddHBand="1" w:evenHBand="0" w:firstRowFirstColumn="0" w:firstRowLastColumn="0" w:lastRowFirstColumn="0" w:lastRowLastColumn="0"/>
+        </w:trPr>
+        <w:tc>
+          <w:tcPr>
+            <w:cnfStyle w:val="001000000000" w:firstRow="0" w:lastRow="0" w:firstColumn="1" w:lastColumn="0" w:oddVBand="0" w:evenVBand="0" w:oddHBand="0" w:evenHBand="0" w:firstRowFirstColumn="0" w:firstRowLastColumn="0" w:lastRowFirstColumn="0" w:lastRowLastColumn="0"/>
+            <w:tcW w:w="1728" w:type="dxa"/>
+          </w:tcPr>
+          <w:p>
+            <w:r>
+              <w:t>mel</w:t>
+            </w:r>
+          </w:p>
+        </w:tc>
+        <w:tc>
+          <w:tcPr>
+            <w:tcW w:w="1728" w:type="dxa"/>
+          </w:tcPr>
+          <w:p>
+            <w:pPr>
+              <w:cnfStyle w:val="000000100000" w:firstRow="0" w:lastRow="0" w:firstColumn="0" w:lastColumn="0" w:oddVBand="0" w:evenVBand="0" w:oddHBand="1" w:evenHBand="0" w:firstRowFirstColumn="0" w:firstRowLastColumn="0" w:lastRowFirstColumn="0" w:lastRowLastColumn="0"/>
+            </w:pPr>
+            <w:r>
+              <w:t>272</w:t>
+            </w:r>
+          </w:p>
+        </w:tc>
+        <w:tc>
+          <w:tcPr>
+            <w:tcW w:w="1728" w:type="dxa"/>
+          </w:tcPr>
+          <w:p>
+            <w:pPr>
+              <w:cnfStyle w:val="000000100000" w:firstRow="0" w:lastRow="0" w:firstColumn="0" w:lastColumn="0" w:oddVBand="0" w:evenVBand="0" w:oddHBand="1" w:evenHBand="0" w:firstRowFirstColumn="0" w:firstRowLastColumn="0" w:lastRowFirstColumn="0" w:lastRowLastColumn="0"/>
+            </w:pPr>
+            <w:r>
+              <w:t>0.054</w:t>
+            </w:r>
+          </w:p>
+        </w:tc>
+        <w:tc>
+          <w:tcPr>
+            <w:tcW w:w="1728" w:type="dxa"/>
+          </w:tcPr>
+          <w:p>
+            <w:pPr>
+              <w:cnfStyle w:val="000000100000" w:firstRow="0" w:lastRow="0" w:firstColumn="0" w:lastColumn="0" w:oddVBand="0" w:evenVBand="0" w:oddHBand="1" w:evenHBand="0" w:firstRowFirstColumn="0" w:firstRowLastColumn="0" w:lastRowFirstColumn="0" w:lastRowLastColumn="0"/>
+            </w:pPr>
+            <w:r>
+              <w:t>0.136</w:t>
+            </w:r>
+          </w:p>
+        </w:tc>
+        <w:tc>
+          <w:tcPr>
+            <w:tcW w:w="1728" w:type="dxa"/>
+          </w:tcPr>
+          <w:p>
+            <w:pPr>
+              <w:cnfStyle w:val="000000100000" w:firstRow="0" w:lastRow="0" w:firstColumn="0" w:lastColumn="0" w:oddVBand="0" w:evenVBand="0" w:oddHBand="1" w:evenHBand="0" w:firstRowFirstColumn="0" w:firstRowLastColumn="0" w:lastRowFirstColumn="0" w:lastRowLastColumn="0"/>
+            </w:pPr>
+            <w:r>
+              <w:t>0.128</w:t>
+            </w:r>
+          </w:p>
+        </w:tc>
+      </w:tr>
+      <w:tr>
+        <w:trPr>
+          <w:cnfStyle w:val="000000010000" w:firstRow="0" w:lastRow="0" w:firstColumn="0" w:lastColumn="0" w:oddVBand="0" w:evenVBand="0" w:oddHBand="0" w:evenHBand="1" w:firstRowFirstColumn="0" w:firstRowLastColumn="0" w:lastRowFirstColumn="0" w:lastRowLastColumn="0"/>
+        </w:trPr>
+        <w:tc>
+          <w:tcPr>
+            <w:cnfStyle w:val="001000000000" w:firstRow="0" w:lastRow="0" w:firstColumn="1" w:lastColumn="0" w:oddVBand="0" w:evenVBand="0" w:oddHBand="0" w:evenHBand="0" w:firstRowFirstColumn="0" w:firstRowLastColumn="0" w:lastRowFirstColumn="0" w:lastRowLastColumn="0"/>
+            <w:tcW w:w="1728" w:type="dxa"/>
+          </w:tcPr>
+          <w:p>
+            <w:r>
+              <w:t>AST</w:t>
+            </w:r>
+          </w:p>
+        </w:tc>
+        <w:tc>
+          <w:tcPr>
+            <w:tcW w:w="1728" w:type="dxa"/>
+          </w:tcPr>
+          <w:p>
+            <w:pPr>
+              <w:cnfStyle w:val="000000010000" w:firstRow="0" w:lastRow="0" w:firstColumn="0" w:lastColumn="0" w:oddVBand="0" w:evenVBand="0" w:oddHBand="0" w:evenHBand="1" w:firstRowFirstColumn="0" w:firstRowLastColumn="0" w:lastRowFirstColumn="0" w:lastRowLastColumn="0"/>
+            </w:pPr>
+            <w:r>
+              <w:t>272</w:t>
+            </w:r>
+          </w:p>
+        </w:tc>
+        <w:tc>
+          <w:tcPr>
+            <w:tcW w:w="1728" w:type="dxa"/>
+          </w:tcPr>
+          <w:p>
+            <w:pPr>
+              <w:cnfStyle w:val="000000010000" w:firstRow="0" w:lastRow="0" w:firstColumn="0" w:lastColumn="0" w:oddVBand="0" w:evenVBand="0" w:oddHBand="0" w:evenHBand="1" w:firstRowFirstColumn="0" w:firstRowLastColumn="0" w:lastRowFirstColumn="0" w:lastRowLastColumn="0"/>
+            </w:pPr>
+            <w:r>
+              <w:t>0.102</w:t>
+            </w:r>
+          </w:p>
+        </w:tc>
+        <w:tc>
+          <w:tcPr>
+            <w:tcW w:w="1728" w:type="dxa"/>
+          </w:tcPr>
+          <w:p>
+            <w:pPr>
+              <w:cnfStyle w:val="000000010000" w:firstRow="0" w:lastRow="0" w:firstColumn="0" w:lastColumn="0" w:oddVBand="0" w:evenVBand="0" w:oddHBand="0" w:evenHBand="1" w:firstRowFirstColumn="0" w:firstRowLastColumn="0" w:lastRowFirstColumn="0" w:lastRowLastColumn="0"/>
+            </w:pPr>
+            <w:r>
+              <w:t>0.259</w:t>
+            </w:r>
+          </w:p>
+        </w:tc>
+        <w:tc>
+          <w:tcPr>
+            <w:tcW w:w="1728" w:type="dxa"/>
+          </w:tcPr>
+          <w:p>
+            <w:pPr>
+              <w:cnfStyle w:val="000000010000" w:firstRow="0" w:lastRow="0" w:firstColumn="0" w:lastColumn="0" w:oddVBand="0" w:evenVBand="0" w:oddHBand="0" w:evenHBand="1" w:firstRowFirstColumn="0" w:firstRowLastColumn="0" w:lastRowFirstColumn="0" w:lastRowLastColumn="0"/>
+            </w:pPr>
+            <w:r>
+              <w:t>0.204</w:t>
+            </w:r>
+          </w:p>
+        </w:tc>
+      </w:tr>
+      <w:tr>
+        <w:trPr>
+          <w:cnfStyle w:val="000000100000" w:firstRow="0" w:lastRow="0" w:firstColumn="0" w:lastColumn="0" w:oddVBand="0" w:evenVBand="0" w:oddHBand="1" w:evenHBand="0" w:firstRowFirstColumn="0" w:firstRowLastColumn="0" w:lastRowFirstColumn="0" w:lastRowLastColumn="0"/>
+        </w:trPr>
+        <w:tc>
+          <w:tcPr>
+            <w:cnfStyle w:val="001000000000" w:firstRow="0" w:lastRow="0" w:firstColumn="1" w:lastColumn="0" w:oddVBand="0" w:evenVBand="0" w:oddHBand="0" w:evenHBand="0" w:firstRowFirstColumn="0" w:firstRowLastColumn="0" w:lastRowFirstColumn="0" w:lastRowLastColumn="0"/>
+            <w:tcW w:w="1728" w:type="dxa"/>
+          </w:tcPr>
+          <w:p>
+            <w:r>
+              <w:t>AST + аудиофильтр</w:t>
+            </w:r>
+          </w:p>
+        </w:tc>
+        <w:tc>
+          <w:tcPr>
+            <w:tcW w:w="1728" w:type="dxa"/>
+          </w:tcPr>
+          <w:p>
+            <w:pPr>
+              <w:cnfStyle w:val="000000100000" w:firstRow="0" w:lastRow="0" w:firstColumn="0" w:lastColumn="0" w:oddVBand="0" w:evenVBand="0" w:oddHBand="1" w:evenHBand="0" w:firstRowFirstColumn="0" w:firstRowLastColumn="0" w:lastRowFirstColumn="0" w:lastRowLastColumn="0"/>
+            </w:pPr>
+            <w:r>
+              <w:t>184</w:t>
+            </w:r>
+          </w:p>
+        </w:tc>
+        <w:tc>
+          <w:tcPr>
+            <w:tcW w:w="1728" w:type="dxa"/>
+          </w:tcPr>
+          <w:p>
+            <w:pPr>
+              <w:cnfStyle w:val="000000100000" w:firstRow="0" w:lastRow="0" w:firstColumn="0" w:lastColumn="0" w:oddVBand="0" w:evenVBand="0" w:oddHBand="1" w:evenHBand="0" w:firstRowFirstColumn="0" w:firstRowLastColumn="0" w:lastRowFirstColumn="0" w:lastRowLastColumn="0"/>
+            </w:pPr>
+            <w:r>
+              <w:t>0.075</w:t>
+            </w:r>
+          </w:p>
+        </w:tc>
+        <w:tc>
+          <w:tcPr>
+            <w:tcW w:w="1728" w:type="dxa"/>
+          </w:tcPr>
+          <w:p>
+            <w:pPr>
+              <w:cnfStyle w:val="000000100000" w:firstRow="0" w:lastRow="0" w:firstColumn="0" w:lastColumn="0" w:oddVBand="0" w:evenVBand="0" w:oddHBand="1" w:evenHBand="0" w:firstRowFirstColumn="0" w:firstRowLastColumn="0" w:lastRowFirstColumn="0" w:lastRowLastColumn="0"/>
+            </w:pPr>
+            <w:r>
+              <w:t>0.211</w:t>
+            </w:r>
+          </w:p>
+        </w:tc>
+        <w:tc>
+          <w:tcPr>
+            <w:tcW w:w="1728" w:type="dxa"/>
+          </w:tcPr>
+          <w:p>
+            <w:pPr>
+              <w:cnfStyle w:val="000000100000" w:firstRow="0" w:lastRow="0" w:firstColumn="0" w:lastColumn="0" w:oddVBand="0" w:evenVBand="0" w:oddHBand="1" w:evenHBand="0" w:firstRowFirstColumn="0" w:firstRowLastColumn="0" w:lastRowFirstColumn="0" w:lastRowLastColumn="0"/>
+            </w:pPr>
+            <w:r>
+              <w:t>0.159</w:t>
+            </w:r>
+          </w:p>
+        </w:tc>
+      </w:tr>
+      <w:tr>
+        <w:trPr>
+          <w:cnfStyle w:val="000000010000" w:firstRow="0" w:lastRow="0" w:firstColumn="0" w:lastColumn="0" w:oddVBand="0" w:evenVBand="0" w:oddHBand="0" w:evenHBand="1" w:firstRowFirstColumn="0" w:firstRowLastColumn="0" w:lastRowFirstColumn="0" w:lastRowLastColumn="0"/>
+        </w:trPr>
+        <w:tc>
+          <w:tcPr>
+            <w:cnfStyle w:val="001000000000" w:firstRow="0" w:lastRow="0" w:firstColumn="1" w:lastColumn="0" w:oddVBand="0" w:evenVBand="0" w:oddHBand="0" w:evenHBand="0" w:firstRowFirstColumn="0" w:firstRowLastColumn="0" w:lastRowFirstColumn="0" w:lastRowLastColumn="0"/>
+            <w:tcW w:w="1728" w:type="dxa"/>
+          </w:tcPr>
+          <w:p>
+            <w:r>
+              <w:t>AST + полная очистка</w:t>
+            </w:r>
+          </w:p>
+        </w:tc>
+        <w:tc>
+          <w:tcPr>
+            <w:tcW w:w="1728" w:type="dxa"/>
+          </w:tcPr>
+          <w:p>
+            <w:pPr>
+              <w:cnfStyle w:val="000000010000" w:firstRow="0" w:lastRow="0" w:firstColumn="0" w:lastColumn="0" w:oddVBand="0" w:evenVBand="0" w:oddHBand="0" w:evenHBand="1" w:firstRowFirstColumn="0" w:firstRowLastColumn="0" w:lastRowFirstColumn="0" w:lastRowLastColumn="0"/>
+            </w:pPr>
+            <w:r>
+              <w:t>98</w:t>
+            </w:r>
+          </w:p>
+        </w:tc>
+        <w:tc>
+          <w:tcPr>
+            <w:tcW w:w="1728" w:type="dxa"/>
+          </w:tcPr>
+          <w:p>
+            <w:pPr>
+              <w:cnfStyle w:val="000000010000" w:firstRow="0" w:lastRow="0" w:firstColumn="0" w:lastColumn="0" w:oddVBand="0" w:evenVBand="0" w:oddHBand="0" w:evenHBand="1" w:firstRowFirstColumn="0" w:firstRowLastColumn="0" w:lastRowFirstColumn="0" w:lastRowLastColumn="0"/>
+            </w:pPr>
+            <w:r>
+              <w:t>0.075</w:t>
+            </w:r>
+          </w:p>
+        </w:tc>
+        <w:tc>
+          <w:tcPr>
+            <w:tcW w:w="1728" w:type="dxa"/>
+          </w:tcPr>
+          <w:p>
+            <w:pPr>
+              <w:cnfStyle w:val="000000010000" w:firstRow="0" w:lastRow="0" w:firstColumn="0" w:lastColumn="0" w:oddVBand="0" w:evenVBand="0" w:oddHBand="0" w:evenHBand="1" w:firstRowFirstColumn="0" w:firstRowLastColumn="0" w:lastRowFirstColumn="0" w:lastRowLastColumn="0"/>
+            </w:pPr>
+            <w:r>
+              <w:t>0.224</w:t>
+            </w:r>
+          </w:p>
+        </w:tc>
+        <w:tc>
+          <w:tcPr>
+            <w:tcW w:w="1728" w:type="dxa"/>
+          </w:tcPr>
+          <w:p>
+            <w:pPr>
+              <w:cnfStyle w:val="000000010000" w:firstRow="0" w:lastRow="0" w:firstColumn="0" w:lastColumn="0" w:oddVBand="0" w:evenVBand="0" w:oddHBand="0" w:evenHBand="1" w:firstRowFirstColumn="0" w:firstRowLastColumn="0" w:lastRowFirstColumn="0" w:lastRowLastColumn="0"/>
+            </w:pPr>
+            <w:r>
+              <w:t>0.163</w:t>
+            </w:r>
+          </w:p>
+        </w:tc>
+      </w:tr>
+      <w:tr>
+        <w:trPr>
+          <w:cnfStyle w:val="000000100000" w:firstRow="0" w:lastRow="0" w:firstColumn="0" w:lastColumn="0" w:oddVBand="0" w:evenVBand="0" w:oddHBand="1" w:evenHBand="0" w:firstRowFirstColumn="0" w:firstRowLastColumn="0" w:lastRowFirstColumn="0" w:lastRowLastColumn="0"/>
+        </w:trPr>
+        <w:tc>
+          <w:tcPr>
+            <w:cnfStyle w:val="001000000000" w:firstRow="0" w:lastRow="0" w:firstColumn="1" w:lastColumn="0" w:oddVBand="0" w:evenVBand="0" w:oddHBand="0" w:evenHBand="0" w:firstRowFirstColumn="0" w:firstRowLastColumn="0" w:lastRowFirstColumn="0" w:lastRowLastColumn="0"/>
+            <w:tcW w:w="1728" w:type="dxa"/>
+          </w:tcPr>
+          <w:p>
+            <w:r>
+              <w:t>AST + случайные 98</w:t>
+            </w:r>
+          </w:p>
+        </w:tc>
+        <w:tc>
+          <w:tcPr>
+            <w:tcW w:w="1728" w:type="dxa"/>
+          </w:tcPr>
+          <w:p>
+            <w:pPr>
+              <w:cnfStyle w:val="000000100000" w:firstRow="0" w:lastRow="0" w:firstColumn="0" w:lastColumn="0" w:oddVBand="0" w:evenVBand="0" w:oddHBand="1" w:evenHBand="0" w:firstRowFirstColumn="0" w:firstRowLastColumn="0" w:lastRowFirstColumn="0" w:lastRowLastColumn="0"/>
+            </w:pPr>
+            <w:r>
+              <w:t>98</w:t>
+            </w:r>
+          </w:p>
+        </w:tc>
+        <w:tc>
+          <w:tcPr>
+            <w:tcW w:w="1728" w:type="dxa"/>
+          </w:tcPr>
+          <w:p>
+            <w:pPr>
+              <w:cnfStyle w:val="000000100000" w:firstRow="0" w:lastRow="0" w:firstColumn="0" w:lastColumn="0" w:oddVBand="0" w:evenVBand="0" w:oddHBand="1" w:evenHBand="0" w:firstRowFirstColumn="0" w:firstRowLastColumn="0" w:lastRowFirstColumn="0" w:lastRowLastColumn="0"/>
+            </w:pPr>
+            <w:r>
+              <w:t>0.061</w:t>
+            </w:r>
+          </w:p>
+        </w:tc>
+        <w:tc>
+          <w:tcPr>
+            <w:tcW w:w="1728" w:type="dxa"/>
+          </w:tcPr>
+          <w:p>
+            <w:pPr>
+              <w:cnfStyle w:val="000000100000" w:firstRow="0" w:lastRow="0" w:firstColumn="0" w:lastColumn="0" w:oddVBand="0" w:evenVBand="0" w:oddHBand="1" w:evenHBand="0" w:firstRowFirstColumn="0" w:firstRowLastColumn="0" w:lastRowFirstColumn="0" w:lastRowLastColumn="0"/>
+            </w:pPr>
+            <w:r>
+              <w:t>0.218</w:t>
+            </w:r>
+          </w:p>
+        </w:tc>
+        <w:tc>
+          <w:tcPr>
+            <w:tcW w:w="1728" w:type="dxa"/>
+          </w:tcPr>
+          <w:p>
+            <w:pPr>
+              <w:cnfStyle w:val="000000100000" w:firstRow="0" w:lastRow="0" w:firstColumn="0" w:lastColumn="0" w:oddVBand="0" w:evenVBand="0" w:oddHBand="1" w:evenHBand="0" w:firstRowFirstColumn="0" w:firstRowLastColumn="0" w:lastRowFirstColumn="0" w:lastRowLastColumn="0"/>
+            </w:pPr>
+            <w:r>
+              <w:t>0.165</w:t>
+            </w:r>
+          </w:p>
+        </w:tc>
+      </w:tr>
+      <w:tr>
+        <w:trPr>
+          <w:cnfStyle w:val="000000010000" w:firstRow="0" w:lastRow="0" w:firstColumn="0" w:lastColumn="0" w:oddVBand="0" w:evenVBand="0" w:oddHBand="0" w:evenHBand="1" w:firstRowFirstColumn="0" w:firstRowLastColumn="0" w:lastRowFirstColumn="0" w:lastRowLastColumn="0"/>
+        </w:trPr>
+        <w:tc>
+          <w:tcPr>
+            <w:cnfStyle w:val="001000000000" w:firstRow="0" w:lastRow="0" w:firstColumn="1" w:lastColumn="0" w:oddVBand="0" w:evenVBand="0" w:oddHBand="0" w:evenHBand="0" w:firstRowFirstColumn="0" w:firstRowLastColumn="0" w:lastRowFirstColumn="0" w:lastRowLastColumn="0"/>
+            <w:tcW w:w="1728" w:type="dxa"/>
+          </w:tcPr>
+          <w:p>
+            <w:r>
+              <w:t>Ridge AST</w:t>
+            </w:r>
+          </w:p>
+        </w:tc>
+        <w:tc>
+          <w:tcPr>
+            <w:tcW w:w="1728" w:type="dxa"/>
+          </w:tcPr>
+          <w:p>
+            <w:pPr>
+              <w:cnfStyle w:val="000000010000" w:firstRow="0" w:lastRow="0" w:firstColumn="0" w:lastColumn="0" w:oddVBand="0" w:evenVBand="0" w:oddHBand="0" w:evenHBand="1" w:firstRowFirstColumn="0" w:firstRowLastColumn="0" w:lastRowFirstColumn="0" w:lastRowLastColumn="0"/>
+            </w:pPr>
+            <w:r>
+              <w:t>272</w:t>
+            </w:r>
+          </w:p>
+        </w:tc>
+        <w:tc>
+          <w:tcPr>
+            <w:tcW w:w="1728" w:type="dxa"/>
+          </w:tcPr>
+          <w:p>
+            <w:pPr>
+              <w:cnfStyle w:val="000000010000" w:firstRow="0" w:lastRow="0" w:firstColumn="0" w:lastColumn="0" w:oddVBand="0" w:evenVBand="0" w:oddHBand="0" w:evenHBand="1" w:firstRowFirstColumn="0" w:firstRowLastColumn="0" w:lastRowFirstColumn="0" w:lastRowLastColumn="0"/>
+            </w:pPr>
+            <w:r>
+              <w:t>0.102</w:t>
+            </w:r>
+          </w:p>
+        </w:tc>
+        <w:tc>
+          <w:tcPr>
+            <w:tcW w:w="1728" w:type="dxa"/>
+          </w:tcPr>
+          <w:p>
+            <w:pPr>
+              <w:cnfStyle w:val="000000010000" w:firstRow="0" w:lastRow="0" w:firstColumn="0" w:lastColumn="0" w:oddVBand="0" w:evenVBand="0" w:oddHBand="0" w:evenHBand="1" w:firstRowFirstColumn="0" w:firstRowLastColumn="0" w:lastRowFirstColumn="0" w:lastRowLastColumn="0"/>
+            </w:pPr>
+            <w:r>
+              <w:t>0.286</w:t>
+            </w:r>
+          </w:p>
+        </w:tc>
+        <w:tc>
+          <w:tcPr>
+            <w:tcW w:w="1728" w:type="dxa"/>
+          </w:tcPr>
+          <w:p>
+            <w:pPr>
+              <w:cnfStyle w:val="000000010000" w:firstRow="0" w:lastRow="0" w:firstColumn="0" w:lastColumn="0" w:oddVBand="0" w:evenVBand="0" w:oddHBand="0" w:evenHBand="1" w:firstRowFirstColumn="0" w:firstRowLastColumn="0" w:lastRowFirstColumn="0" w:lastRowLastColumn="0"/>
+            </w:pPr>
+            <w:r>
+              <w:t>0.209</w:t>
+            </w:r>
+          </w:p>
+        </w:tc>
+      </w:tr>
+    </w:tbl>
+    <w:p>
+      <w:pPr>
+        <w:rPr>
+          <w:lang w:val="ru-RU"/>
+        </w:rPr>
+      </w:pPr>
+      <w:r>
+        <w:rPr>
+          <w:noProof/>
+        </w:rPr>
+        <w:drawing>
+          <wp:inline distT="0" distB="0" distL="0" distR="0">
+            <wp:extent cx="5669280" cy="2632166"/>
+            <wp:effectExtent l="0" t="0" r="0" b="0"/>
+            <wp:docPr id="5" name="Picture 5"/>
+            <wp:cNvGraphicFramePr>
+              <a:graphicFrameLocks xmlns:a="http://schemas.openxmlformats.org/drawingml/2006/main" noChangeAspect="1"/>
+            </wp:cNvGraphicFramePr>
+            <a:graphic xmlns:a="http://schemas.openxmlformats.org/drawingml/2006/main">
+              <a:graphicData uri="http://schemas.openxmlformats.org/drawingml/2006/picture">
+                <pic:pic xmlns:pic="http://schemas.openxmlformats.org/drawingml/2006/picture">
+                  <pic:nvPicPr>
+                    <pic:cNvPr id="0" name="results.png"/>
+                    <pic:cNvPicPr/>
+                  </pic:nvPicPr>
+                  <pic:blipFill>
+                    <a:blip r:embed="rId10"/>
+                    <a:stretch>
+                      <a:fillRect/>
+                    </a:stretch>
+                  </pic:blipFill>
+                  <pic:spPr>
+                    <a:xfrm>
+                      <a:off x="0" y="0"/>
+                      <a:ext cx="5669280" cy="2632166"/>
+                    </a:xfrm>
+                    <a:prstGeom prst="rect">
+                      <a:avLst/>
+                    </a:prstGeom>
+                  </pic:spPr>
+                </pic:pic>
+              </a:graphicData>
+            </a:graphic>
+          </wp:inline>
+        </w:drawing>
+      </w:r>
+    </w:p>
+    <w:p>
+      <w:pPr>
+        <w:rPr>
+          <w:lang w:val="ru-RU"/>
+        </w:rPr>
+      </w:pPr>
+      <w:r>
+        <w:t>AST</w:t>
+      </w:r>
+      <w:r>
+        <w:rPr>
+          <w:lang w:val="ru-RU"/>
+        </w:rPr>
+        <w:t xml:space="preserve"> без фильтра выбран по среднему </w:t>
+      </w:r>
+      <w:r>
+        <w:t>validation</w:t>
+      </w:r>
+      <w:r>
+        <w:rPr>
+          <w:lang w:val="ru-RU"/>
+        </w:rPr>
+        <w:t xml:space="preserve"> </w:t>
+      </w:r>
+      <w:r>
+        <w:t>MRR</w:t>
+      </w:r>
+      <w:r>
+        <w:rPr>
+          <w:lang w:val="ru-RU"/>
+        </w:rPr>
+        <w:t xml:space="preserve">: 0.167 против 0.116 у </w:t>
+      </w:r>
+      <w:proofErr w:type="spellStart"/>
+      <w:r>
+        <w:t>mel</w:t>
+      </w:r>
+      <w:proofErr w:type="spellEnd"/>
+      <w:r>
+        <w:rPr>
+          <w:lang w:val="ru-RU"/>
+        </w:rPr>
+        <w:t xml:space="preserve">. На </w:t>
+      </w:r>
+      <w:r>
+        <w:t>test</w:t>
+      </w:r>
+      <w:r>
+        <w:rPr>
+          <w:lang w:val="ru-RU"/>
+        </w:rPr>
+        <w:t xml:space="preserve"> его средний </w:t>
+      </w:r>
+      <w:r>
+        <w:t>MRR</w:t>
+      </w:r>
+      <w:r>
+        <w:rPr>
+          <w:lang w:val="ru-RU"/>
+        </w:rPr>
+        <w:t xml:space="preserve"> равен 0.204 ± 0.031 по </w:t>
+      </w:r>
+      <w:r>
+        <w:t>seed</w:t>
+      </w:r>
+      <w:r>
+        <w:rPr>
+          <w:lang w:val="ru-RU"/>
+        </w:rPr>
+        <w:t xml:space="preserve">; у </w:t>
+      </w:r>
+      <w:proofErr w:type="spellStart"/>
+      <w:r>
+        <w:t>mel</w:t>
+      </w:r>
+      <w:proofErr w:type="spellEnd"/>
+      <w:r>
+        <w:rPr>
+          <w:lang w:val="ru-RU"/>
+        </w:rPr>
+        <w:t xml:space="preserve"> — 0.128 ± 0.020. Ожидаемый </w:t>
+      </w:r>
+      <w:r>
+        <w:t>MRR</w:t>
+      </w:r>
+      <w:r>
+        <w:rPr>
+          <w:lang w:val="ru-RU"/>
+        </w:rPr>
+        <w:t xml:space="preserve"> случайного ранжирования — 0.091. Парный </w:t>
+      </w:r>
+      <w:r>
+        <w:t>bootstrap</w:t>
+      </w:r>
+      <w:r>
+        <w:rPr>
+          <w:lang w:val="ru-RU"/>
+        </w:rPr>
+        <w:t xml:space="preserve"> по 49 запросам для разности </w:t>
+      </w:r>
+      <w:r>
+        <w:t>AST</w:t>
+      </w:r>
+      <w:r>
+        <w:rPr>
+          <w:lang w:val="ru-RU"/>
+        </w:rPr>
+        <w:t xml:space="preserve"> − </w:t>
+      </w:r>
+      <w:proofErr w:type="spellStart"/>
+      <w:r>
+        <w:t>mel</w:t>
+      </w:r>
+      <w:proofErr w:type="spellEnd"/>
+      <w:r>
+        <w:rPr>
+          <w:lang w:val="ru-RU"/>
+        </w:rPr>
+        <w:t xml:space="preserve"> даёт 95% интервал [0.002; 0.152]. Интервал широкий; он учитывает тестовые запросы при фиксированных обученных </w:t>
+      </w:r>
+      <w:r>
+        <w:t>seed</w:t>
+      </w:r>
+      <w:r>
+        <w:rPr>
+          <w:lang w:val="ru-RU"/>
+        </w:rPr>
+        <w:t xml:space="preserve">, но не сбор нового </w:t>
+      </w:r>
+      <w:proofErr w:type="spellStart"/>
+      <w:r>
+        <w:rPr>
+          <w:lang w:val="ru-RU"/>
+        </w:rPr>
+        <w:t>датасета</w:t>
+      </w:r>
+      <w:proofErr w:type="spellEnd"/>
+      <w:r>
+        <w:rPr>
+          <w:lang w:val="ru-RU"/>
+        </w:rPr>
+        <w:t>.</w:t>
+      </w:r>
+    </w:p>
+    <w:p>
+      <w:pPr>
+        <w:rPr>
+          <w:lang w:val="ru-RU"/>
+        </w:rPr>
+      </w:pPr>
+      <w:r>
+        <w:rPr>
+          <w:lang w:val="ru-RU"/>
+        </w:rPr>
+        <w:t xml:space="preserve">Строгая фильтрация не улучшила </w:t>
+      </w:r>
+      <w:r>
+        <w:t>retrieval</w:t>
+      </w:r>
+      <w:r>
+        <w:rPr>
+          <w:lang w:val="ru-RU"/>
+        </w:rPr>
+        <w:t xml:space="preserve">: </w:t>
+      </w:r>
+      <w:r>
+        <w:t>MRR</w:t>
+      </w:r>
+      <w:r>
+        <w:rPr>
+          <w:lang w:val="ru-RU"/>
+        </w:rPr>
+        <w:t xml:space="preserve"> 0.163 на 98 парах, близко к случайной </w:t>
+      </w:r>
+      <w:proofErr w:type="spellStart"/>
+      <w:r>
+        <w:rPr>
+          <w:lang w:val="ru-RU"/>
+        </w:rPr>
+        <w:t>подвыборке</w:t>
+      </w:r>
+      <w:proofErr w:type="spellEnd"/>
+      <w:r>
+        <w:rPr>
+          <w:lang w:val="ru-RU"/>
+        </w:rPr>
+        <w:t xml:space="preserve"> того же размера (0.165). Возможные причины — потеря обучающих примеров, исключение вокала вместе с речью и ошибки текстовой эвристики. Гипотеза о пользе очистки в текущем опыте не подтверждена. Это не </w:t>
+      </w:r>
+      <w:r>
+        <w:rPr>
+          <w:lang w:val="ru-RU"/>
+        </w:rPr>
+        <w:lastRenderedPageBreak/>
+        <w:t>доказывает бесполезность ручной очистки: автоматические правила ещё не проверены человеком.</w:t>
+      </w:r>
+    </w:p>
+    <w:p>
+      <w:pPr>
+        <w:rPr>
+          <w:lang w:val="ru-RU"/>
+        </w:rPr>
+      </w:pPr>
+      <w:r>
+        <w:t>Ridge</w:t>
+      </w:r>
+      <w:r>
+        <w:rPr>
+          <w:lang w:val="ru-RU"/>
+        </w:rPr>
+        <w:t xml:space="preserve"> на </w:t>
+      </w:r>
+      <w:r>
+        <w:t>AST</w:t>
+      </w:r>
+      <w:r>
+        <w:rPr>
+          <w:lang w:val="ru-RU"/>
+        </w:rPr>
+        <w:t xml:space="preserve"> достигает </w:t>
+      </w:r>
+      <w:r>
+        <w:t>MRR</w:t>
+      </w:r>
+      <w:r>
+        <w:rPr>
+          <w:lang w:val="ru-RU"/>
+        </w:rPr>
+        <w:t xml:space="preserve"> 0.209 и </w:t>
+      </w:r>
+      <w:r>
+        <w:t>Hit</w:t>
+      </w:r>
+      <w:r>
+        <w:rPr>
+          <w:lang w:val="ru-RU"/>
+        </w:rPr>
+        <w:t xml:space="preserve">@5 0.286. Сложная </w:t>
+      </w:r>
+      <w:proofErr w:type="spellStart"/>
+      <w:r>
+        <w:rPr>
+          <w:lang w:val="ru-RU"/>
+        </w:rPr>
+        <w:t>контрастивная</w:t>
+      </w:r>
+      <w:proofErr w:type="spellEnd"/>
+      <w:r>
+        <w:rPr>
+          <w:lang w:val="ru-RU"/>
+        </w:rPr>
+        <w:t xml:space="preserve"> модель не превосходит этот простой </w:t>
+      </w:r>
+      <w:r>
+        <w:t>baseline</w:t>
+      </w:r>
+      <w:r>
+        <w:rPr>
+          <w:lang w:val="ru-RU"/>
+        </w:rPr>
+        <w:t xml:space="preserve"> убедительно. При текущем размере данных важнее проверить пары и уместность рекомендаций, чем усложнять архитектуру. Значения исходного эксперимента из раздела 8 нельзя напрямую сравнивать с новыми: изменились выборка и размер галереи.</w:t>
+      </w:r>
+    </w:p>
+    <w:p>
+      <w:pPr>
+        <w:rPr>
+          <w:lang w:val="ru-RU"/>
+        </w:rPr>
+      </w:pPr>
+      <w:r>
+        <w:rPr>
+          <w:noProof/>
+        </w:rPr>
+        <w:drawing>
+          <wp:inline distT="0" distB="0" distL="0" distR="0">
+            <wp:extent cx="5669280" cy="2061556"/>
+            <wp:effectExtent l="0" t="0" r="0" b="0"/>
+            <wp:docPr id="6" name="Picture 6"/>
+            <wp:cNvGraphicFramePr>
+              <a:graphicFrameLocks xmlns:a="http://schemas.openxmlformats.org/drawingml/2006/main" noChangeAspect="1"/>
+            </wp:cNvGraphicFramePr>
+            <a:graphic xmlns:a="http://schemas.openxmlformats.org/drawingml/2006/main">
+              <a:graphicData uri="http://schemas.openxmlformats.org/drawingml/2006/picture">
+                <pic:pic xmlns:pic="http://schemas.openxmlformats.org/drawingml/2006/picture">
+                  <pic:nvPicPr>
+                    <pic:cNvPr id="0" name="training.png"/>
+                    <pic:cNvPicPr/>
+                  </pic:nvPicPr>
+                  <pic:blipFill>
+                    <a:blip r:embed="rId11"/>
+                    <a:stretch>
+                      <a:fillRect/>
+                    </a:stretch>
+                  </pic:blipFill>
+                  <pic:spPr>
+                    <a:xfrm>
+                      <a:off x="0" y="0"/>
+                      <a:ext cx="5669280" cy="2061556"/>
+                    </a:xfrm>
+                    <a:prstGeom prst="rect">
+                      <a:avLst/>
+                    </a:prstGeom>
+                  </pic:spPr>
+                </pic:pic>
+              </a:graphicData>
+            </a:graphic>
+          </wp:inline>
+        </w:drawing>
+      </w:r>
+    </w:p>
+    <w:p>
+      <w:pPr>
+        <w:rPr>
+          <w:lang w:val="ru-RU"/>
+        </w:rPr>
+      </w:pPr>
+      <w:r>
+        <w:rPr>
+          <w:lang w:val="ru-RU"/>
+        </w:rPr>
+        <w:t xml:space="preserve">Обучение и </w:t>
+      </w:r>
+      <w:r>
+        <w:t>validation</w:t>
+      </w:r>
+      <w:r>
+        <w:rPr>
+          <w:lang w:val="ru-RU"/>
+        </w:rPr>
+        <w:t xml:space="preserve"> для </w:t>
+      </w:r>
+      <w:r>
+        <w:t>seed</w:t>
+      </w:r>
+      <w:r>
+        <w:rPr>
+          <w:lang w:val="ru-RU"/>
+        </w:rPr>
+        <w:t xml:space="preserve"> 42. У </w:t>
+      </w:r>
+      <w:r>
+        <w:t>AST</w:t>
+      </w:r>
+      <w:r>
+        <w:rPr>
+          <w:lang w:val="ru-RU"/>
+        </w:rPr>
+        <w:t xml:space="preserve"> лучший </w:t>
+      </w:r>
+      <w:r>
+        <w:t>checkpoint</w:t>
+      </w:r>
+      <w:r>
+        <w:rPr>
+          <w:lang w:val="ru-RU"/>
+        </w:rPr>
+        <w:t xml:space="preserve"> получен на эпохе 12. Снижение </w:t>
+      </w:r>
+      <w:r>
+        <w:t>train</w:t>
+      </w:r>
+      <w:r>
+        <w:rPr>
+          <w:lang w:val="ru-RU"/>
+        </w:rPr>
+        <w:t xml:space="preserve"> </w:t>
+      </w:r>
+      <w:r>
+        <w:t>loss</w:t>
+      </w:r>
+      <w:r>
+        <w:rPr>
+          <w:lang w:val="ru-RU"/>
+        </w:rPr>
+        <w:t xml:space="preserve"> без устойчивого роста </w:t>
+      </w:r>
+      <w:r>
+        <w:t>validation</w:t>
+      </w:r>
+      <w:r>
+        <w:rPr>
+          <w:lang w:val="ru-RU"/>
+        </w:rPr>
+        <w:t xml:space="preserve"> </w:t>
+      </w:r>
+      <w:r>
+        <w:t>MRR</w:t>
+      </w:r>
+      <w:r>
+        <w:rPr>
+          <w:lang w:val="ru-RU"/>
+        </w:rPr>
+        <w:t xml:space="preserve"> указывает на риск переобучения; используется ранняя остановка.</w:t>
+      </w:r>
+    </w:p>
+    <w:p>
+      <w:pPr>
+        <w:rPr>
+          <w:lang w:val="ru-RU"/>
+        </w:rPr>
+      </w:pPr>
+      <w:r>
+        <w:rPr>
+          <w:lang w:val="ru-RU"/>
+        </w:rPr>
+        <w:t xml:space="preserve">Источники методов: </w:t>
+      </w:r>
+      <w:proofErr w:type="spellStart"/>
+      <w:r>
+        <w:t>HarmonySet</w:t>
+      </w:r>
+      <w:proofErr w:type="spellEnd"/>
+      <w:r>
+        <w:rPr>
+          <w:lang w:val="ru-RU"/>
+        </w:rPr>
+        <w:t xml:space="preserve"> — </w:t>
+      </w:r>
+      <w:r>
+        <w:t>https</w:t>
+      </w:r>
+      <w:r>
+        <w:rPr>
+          <w:lang w:val="ru-RU"/>
+        </w:rPr>
+        <w:t>://</w:t>
+      </w:r>
+      <w:proofErr w:type="spellStart"/>
+      <w:r>
+        <w:t>arxiv</w:t>
+      </w:r>
+      <w:proofErr w:type="spellEnd"/>
+      <w:r>
+        <w:rPr>
+          <w:lang w:val="ru-RU"/>
+        </w:rPr>
+        <w:t>.</w:t>
+      </w:r>
+      <w:r>
+        <w:t>org</w:t>
+      </w:r>
+      <w:r>
+        <w:rPr>
+          <w:lang w:val="ru-RU"/>
+        </w:rPr>
+        <w:t>/</w:t>
+      </w:r>
+      <w:r>
+        <w:t>abs</w:t>
+      </w:r>
+      <w:r>
+        <w:rPr>
+          <w:lang w:val="ru-RU"/>
+        </w:rPr>
+        <w:t xml:space="preserve">/2503.01725; </w:t>
+      </w:r>
+      <w:r>
+        <w:t>AST</w:t>
+      </w:r>
+      <w:r>
+        <w:rPr>
+          <w:lang w:val="ru-RU"/>
+        </w:rPr>
+        <w:t xml:space="preserve"> — </w:t>
+      </w:r>
+      <w:r>
+        <w:t>https</w:t>
+      </w:r>
+      <w:r>
+        <w:rPr>
+          <w:lang w:val="ru-RU"/>
+        </w:rPr>
+        <w:t>://</w:t>
+      </w:r>
+      <w:proofErr w:type="spellStart"/>
+      <w:r>
+        <w:t>arxiv</w:t>
+      </w:r>
+      <w:proofErr w:type="spellEnd"/>
+      <w:r>
+        <w:rPr>
+          <w:lang w:val="ru-RU"/>
+        </w:rPr>
+        <w:t>.</w:t>
+      </w:r>
+      <w:r>
+        <w:t>org</w:t>
+      </w:r>
+      <w:r>
+        <w:rPr>
+          <w:lang w:val="ru-RU"/>
+        </w:rPr>
+        <w:t>/</w:t>
+      </w:r>
+      <w:r>
+        <w:t>abs</w:t>
+      </w:r>
+      <w:r>
+        <w:rPr>
+          <w:lang w:val="ru-RU"/>
+        </w:rPr>
+        <w:t xml:space="preserve">/2104.01778; </w:t>
+      </w:r>
+      <w:r>
+        <w:t>VMCML</w:t>
+      </w:r>
+      <w:r>
+        <w:rPr>
+          <w:lang w:val="ru-RU"/>
+        </w:rPr>
+        <w:t xml:space="preserve"> — </w:t>
+      </w:r>
+      <w:r>
+        <w:t>https</w:t>
+      </w:r>
+      <w:r>
+        <w:rPr>
+          <w:lang w:val="ru-RU"/>
+        </w:rPr>
+        <w:t>://</w:t>
+      </w:r>
+      <w:proofErr w:type="spellStart"/>
+      <w:r>
+        <w:t>arxiv</w:t>
+      </w:r>
+      <w:proofErr w:type="spellEnd"/>
+      <w:r>
+        <w:rPr>
+          <w:lang w:val="ru-RU"/>
+        </w:rPr>
+        <w:t>.</w:t>
+      </w:r>
+      <w:r>
+        <w:t>org</w:t>
+      </w:r>
+      <w:r>
+        <w:rPr>
+          <w:lang w:val="ru-RU"/>
+        </w:rPr>
+        <w:t>/</w:t>
+      </w:r>
+      <w:r>
+        <w:t>abs</w:t>
+      </w:r>
+      <w:r>
+        <w:rPr>
+          <w:lang w:val="ru-RU"/>
+        </w:rPr>
+        <w:t xml:space="preserve">/2303.12379. </w:t>
+      </w:r>
+    </w:p>
+    <w:p>
+      <w:pPr>
+        <w:rPr>
+          <w:lang w:val="ru-RU"/>
+        </w:rPr>
+      </w:pPr>
+      <w:r>
+        <w:rPr>
+          <w:lang w:val="ru-RU"/>
+        </w:rPr>
+        <w:t xml:space="preserve">В </w:t>
+      </w:r>
+      <w:r>
+        <w:t>VMCML</w:t>
+      </w:r>
+      <w:r>
+        <w:rPr>
+          <w:lang w:val="ru-RU"/>
+        </w:rPr>
+        <w:t xml:space="preserve"> видео и музыка сопоставляются в общем пространстве с </w:t>
+      </w:r>
+      <w:proofErr w:type="spellStart"/>
+      <w:r>
+        <w:t>CosFace</w:t>
+      </w:r>
+      <w:proofErr w:type="spellEnd"/>
+      <w:r>
+        <w:rPr>
+          <w:lang w:val="ru-RU"/>
+        </w:rPr>
+        <w:t xml:space="preserve"> </w:t>
+      </w:r>
+      <w:r>
+        <w:t>loss</w:t>
+      </w:r>
+      <w:r>
+        <w:rPr>
+          <w:lang w:val="ru-RU"/>
+        </w:rPr>
+        <w:t xml:space="preserve">. Здесь сохранено </w:t>
+      </w:r>
+      <w:proofErr w:type="spellStart"/>
+      <w:r>
+        <w:rPr>
+          <w:lang w:val="ru-RU"/>
+        </w:rPr>
+        <w:t>контрастивное</w:t>
+      </w:r>
+      <w:proofErr w:type="spellEnd"/>
+      <w:r>
+        <w:rPr>
+          <w:lang w:val="ru-RU"/>
+        </w:rPr>
+        <w:t xml:space="preserve"> обучение как более простой проверяемый </w:t>
+      </w:r>
+      <w:r>
+        <w:t>baseline</w:t>
+      </w:r>
+      <w:r>
+        <w:rPr>
+          <w:lang w:val="ru-RU"/>
+        </w:rPr>
+        <w:t xml:space="preserve">. </w:t>
+      </w:r>
+      <w:proofErr w:type="spellStart"/>
+      <w:r>
+        <w:t>HarmonySet</w:t>
+      </w:r>
+      <w:proofErr w:type="spellEnd"/>
+      <w:r>
+        <w:rPr>
+          <w:lang w:val="ru-RU"/>
+        </w:rPr>
+        <w:t xml:space="preserve"> выбран за доступные ссылки и подробные аннотации ритма, эмоций и темы. Однако задача анализа соответствия исходной пары отличается от рекомендации: наличие пары не является меткой хорошей совместимости. </w:t>
+      </w:r>
+      <w:r>
+        <w:t>AST</w:t>
+      </w:r>
+      <w:r>
+        <w:rPr>
+          <w:lang w:val="ru-RU"/>
+        </w:rPr>
+        <w:t xml:space="preserve"> выбран как </w:t>
+      </w:r>
+      <w:proofErr w:type="spellStart"/>
+      <w:r>
+        <w:rPr>
+          <w:lang w:val="ru-RU"/>
+        </w:rPr>
+        <w:t>предобученный</w:t>
+      </w:r>
+      <w:proofErr w:type="spellEnd"/>
+      <w:r>
+        <w:rPr>
+          <w:lang w:val="ru-RU"/>
+        </w:rPr>
+        <w:t xml:space="preserve"> </w:t>
+      </w:r>
+      <w:proofErr w:type="spellStart"/>
+      <w:r>
+        <w:rPr>
+          <w:lang w:val="ru-RU"/>
+        </w:rPr>
+        <w:t>аудиотрансформер</w:t>
+      </w:r>
+      <w:proofErr w:type="spellEnd"/>
+      <w:r>
+        <w:rPr>
+          <w:lang w:val="ru-RU"/>
+        </w:rPr>
+        <w:t xml:space="preserve">, </w:t>
+      </w:r>
+      <w:r>
+        <w:rPr>
+          <w:lang w:val="ru-RU"/>
+        </w:rPr>
+        <w:t xml:space="preserve">заморозка </w:t>
+      </w:r>
+      <w:proofErr w:type="spellStart"/>
+      <w:r>
+        <w:rPr>
+          <w:lang w:val="ru-RU"/>
+        </w:rPr>
+        <w:t>энкодеров</w:t>
+      </w:r>
+      <w:proofErr w:type="spellEnd"/>
+      <w:r>
+        <w:rPr>
+          <w:lang w:val="ru-RU"/>
+        </w:rPr>
+        <w:t xml:space="preserve"> сокращает стоимость обучения на небольшой выборке.</w:t>
+      </w:r>
+    </w:p>
+    <w:p>
+      <w:pPr>
+        <w:pStyle w:val="Heading2"/>
+        <w:rPr>
+          <w:lang w:val="ru-RU"/>
+        </w:rPr>
+      </w:pPr>
+      <w:r>
+        <w:rPr>
+          <w:lang w:val="ru-RU"/>
+        </w:rPr>
+        <w:t>10.2 Ручная оценка и разбор ошибок</w:t>
+      </w:r>
+    </w:p>
+    <w:p>
+      <w:pPr>
+        <w:rPr>
+          <w:lang w:val="ru-RU"/>
+        </w:rPr>
+      </w:pPr>
+      <w:r>
+        <w:rPr>
+          <w:lang w:val="ru-RU"/>
+        </w:rPr>
+        <w:t xml:space="preserve">Мною были вручную оценены </w:t>
+      </w:r>
+      <w:r>
+        <w:rPr>
+          <w:lang w:val="ru-RU"/>
+        </w:rPr>
+        <w:t>65 пар для семи видео по шкале 0–2</w:t>
+      </w:r>
+      <w:r>
+        <w:rPr>
+          <w:lang w:val="ru-RU"/>
+        </w:rPr>
+        <w:t xml:space="preserve"> с дополнительным словесным описанием совместимости.</w:t>
+      </w:r>
+      <w:r>
+        <w:rPr>
+          <w:lang w:val="ru-RU"/>
+        </w:rPr>
+        <w:t xml:space="preserve"> В одной паре пропущенный балл восстановлен как 0 по явно отрицательному словесному описанию. </w:t>
+      </w:r>
+      <w:proofErr w:type="spellStart"/>
+      <w:r>
+        <w:t>Все</w:t>
+      </w:r>
+      <w:proofErr w:type="spellEnd"/>
+      <w:r>
+        <w:t xml:space="preserve"> </w:t>
+      </w:r>
+      <w:proofErr w:type="spellStart"/>
+      <w:r>
+        <w:t>семь</w:t>
+      </w:r>
+      <w:proofErr w:type="spellEnd"/>
+      <w:r>
+        <w:t xml:space="preserve"> </w:t>
+      </w:r>
+      <w:proofErr w:type="spellStart"/>
+      <w:r>
+        <w:t>видео</w:t>
+      </w:r>
+      <w:proofErr w:type="spellEnd"/>
+      <w:r>
+        <w:t xml:space="preserve"> </w:t>
+      </w:r>
+      <w:proofErr w:type="spellStart"/>
+      <w:r>
+        <w:t>включены</w:t>
+      </w:r>
+      <w:proofErr w:type="spellEnd"/>
+      <w:r>
+        <w:t xml:space="preserve"> в сравнение.</w:t>
+      </w:r>
+    </w:p>
+    <w:p>
+      <w:pPr>
+        <w:rPr>
+          <w:lang w:val="ru-RU"/>
+        </w:rPr>
+      </w:pPr>
+      <w:r>
+        <w:rPr>
+          <w:lang w:val="ru-RU"/>
+        </w:rPr>
+        <w:t xml:space="preserve">В пул входят </w:t>
+      </w:r>
+      <w:r>
+        <w:t>top</w:t>
+      </w:r>
+      <w:r>
+        <w:rPr>
+          <w:lang w:val="ru-RU"/>
+        </w:rPr>
+        <w:t xml:space="preserve">-3 </w:t>
+      </w:r>
+      <w:r>
+        <w:t>AST</w:t>
+      </w:r>
+      <w:r>
+        <w:rPr>
+          <w:lang w:val="ru-RU"/>
+        </w:rPr>
+        <w:t xml:space="preserve">, </w:t>
+      </w:r>
+      <w:r>
+        <w:t>top</w:t>
+      </w:r>
+      <w:r>
+        <w:rPr>
+          <w:lang w:val="ru-RU"/>
+        </w:rPr>
+        <w:t xml:space="preserve">-3 </w:t>
+      </w:r>
+      <w:proofErr w:type="spellStart"/>
+      <w:r>
+        <w:t>mel</w:t>
+      </w:r>
+      <w:proofErr w:type="spellEnd"/>
+      <w:r>
+        <w:rPr>
+          <w:lang w:val="ru-RU"/>
+        </w:rPr>
+        <w:t xml:space="preserve">, три случайные дорожки и оригинал. Кандидат может принадлежать нескольким методам. Средняя оценка </w:t>
+      </w:r>
+      <w:r>
+        <w:t>top</w:t>
+      </w:r>
+      <w:r>
+        <w:rPr>
+          <w:lang w:val="ru-RU"/>
+        </w:rPr>
+        <w:t xml:space="preserve">-3: </w:t>
+      </w:r>
+      <w:r>
+        <w:t>AST</w:t>
+      </w:r>
+      <w:r>
+        <w:rPr>
+          <w:lang w:val="ru-RU"/>
+        </w:rPr>
+        <w:t xml:space="preserve"> — 0.905, </w:t>
+      </w:r>
+      <w:proofErr w:type="spellStart"/>
+      <w:r>
+        <w:t>mel</w:t>
+      </w:r>
+      <w:proofErr w:type="spellEnd"/>
+      <w:r>
+        <w:rPr>
+          <w:lang w:val="ru-RU"/>
+        </w:rPr>
+        <w:t xml:space="preserve"> </w:t>
+      </w:r>
+      <w:r>
+        <w:rPr>
+          <w:lang w:val="ru-RU"/>
+        </w:rPr>
+        <w:lastRenderedPageBreak/>
+        <w:t>— 0.714, случайный выбор — 0.714 (по 21 позиции каждого метода)</w:t>
+      </w:r>
+      <w:r>
+        <w:rPr>
+          <w:lang w:val="ru-RU"/>
+        </w:rPr>
+        <w:t xml:space="preserve">. Средняя оценка оригинала — 1.714 (7 пар). Оценку 2 получили 7 из 21 позиции AST, 6 из 21 mel и 4 из 21 случайного выбора. У </w:t>
+      </w:r>
+      <w:r>
+        <w:t>AST</w:t>
+      </w:r>
+      <w:r>
+        <w:rPr>
+          <w:lang w:val="ru-RU"/>
+        </w:rPr>
+        <w:t xml:space="preserve"> </w:t>
+      </w:r>
+      <w:r>
+        <w:t>top</w:t>
+      </w:r>
+      <w:r>
+        <w:rPr>
+          <w:lang w:val="ru-RU"/>
+        </w:rPr>
+        <w:t xml:space="preserve">-1 оценён на 2 в одном случае, на 1 в двух и на 0 в четырёх. Небольшая разница средних не доказывает превосходство </w:t>
+      </w:r>
+      <w:r>
+        <w:t>AST</w:t>
+      </w:r>
+      <w:r>
+        <w:rPr>
+          <w:lang w:val="ru-RU"/>
+        </w:rPr>
+        <w:t xml:space="preserve">: проверка проведена </w:t>
+      </w:r>
+      <w:r>
+        <w:rPr>
+          <w:lang w:val="ru-RU"/>
+        </w:rPr>
+        <w:t xml:space="preserve">мной, то есть одним человеком, </w:t>
+      </w:r>
+      <w:r>
+        <w:rPr>
+          <w:lang w:val="ru-RU"/>
+        </w:rPr>
+        <w:t>на 7 видео</w:t>
+      </w:r>
+      <w:r>
+        <w:rPr>
+          <w:lang w:val="ru-RU"/>
+        </w:rPr>
+        <w:t xml:space="preserve">. Оценки достаточно </w:t>
+      </w:r>
+      <w:proofErr w:type="spellStart"/>
+      <w:r>
+        <w:rPr>
+          <w:lang w:val="ru-RU"/>
+        </w:rPr>
+        <w:t>субьективны</w:t>
+      </w:r>
+      <w:proofErr w:type="spellEnd"/>
+      <w:r>
+        <w:rPr>
+          <w:lang w:val="ru-RU"/>
+        </w:rPr>
+        <w:t xml:space="preserve"> и могут быть предвзяты из-за личных предпочтений. Мне могло казаться что-то уместным/</w:t>
+      </w:r>
+      <w:proofErr w:type="gramStart"/>
+      <w:r>
+        <w:rPr>
+          <w:lang w:val="ru-RU"/>
+        </w:rPr>
+        <w:t>неуместным ,</w:t>
+      </w:r>
+      <w:proofErr w:type="gramEnd"/>
+      <w:r>
+        <w:rPr>
+          <w:lang w:val="ru-RU"/>
+        </w:rPr>
+        <w:t xml:space="preserve"> что, возможно, для других людей будет совсем иначе восприниматься.</w:t>
+      </w:r>
+    </w:p>
+    <w:p>
+      <w:pPr>
+        <w:rPr>
+          <w:lang w:val="ru-RU"/>
+        </w:rPr>
+      </w:pPr>
+      <w:r>
+        <w:rPr>
+          <w:noProof/>
+        </w:rPr>
+        <w:drawing>
+          <wp:inline distT="0" distB="0" distL="0" distR="0">
+            <wp:extent cx="5669280" cy="1700784"/>
+            <wp:effectExtent l="0" t="0" r="0" b="0"/>
+            <wp:docPr id="7" name="Picture 7"/>
+            <wp:cNvGraphicFramePr>
+              <a:graphicFrameLocks xmlns:a="http://schemas.openxmlformats.org/drawingml/2006/main" noChangeAspect="1"/>
+            </wp:cNvGraphicFramePr>
+            <a:graphic xmlns:a="http://schemas.openxmlformats.org/drawingml/2006/main">
+              <a:graphicData uri="http://schemas.openxmlformats.org/drawingml/2006/picture">
+                <pic:pic xmlns:pic="http://schemas.openxmlformats.org/drawingml/2006/picture">
+                  <pic:nvPicPr>
+                    <pic:cNvPr id="0" name="human_results.png"/>
+                    <pic:cNvPicPr/>
+                  </pic:nvPicPr>
+                  <pic:blipFill>
+                    <a:blip r:embed="rId12"/>
+                    <a:stretch>
+                      <a:fillRect/>
+                    </a:stretch>
+                  </pic:blipFill>
+                  <pic:spPr>
+                    <a:xfrm>
+                      <a:off x="0" y="0"/>
+                      <a:ext cx="5669280" cy="1700784"/>
+                    </a:xfrm>
+                    <a:prstGeom prst="rect">
+                      <a:avLst/>
+                    </a:prstGeom>
+                  </pic:spPr>
+                </pic:pic>
+              </a:graphicData>
+            </a:graphic>
+          </wp:inline>
+        </w:drawing>
+      </w:r>
+    </w:p>
+    <w:p>
+      <w:pPr>
+        <w:rPr>
+          <w:lang w:val="ru-RU"/>
+        </w:rPr>
+      </w:pPr>
+      <w:r>
+        <w:rPr>
+          <w:lang w:val="ru-RU"/>
+        </w:rPr>
+        <w:t xml:space="preserve">Удачный пример — баскетбольный ролик </w:t>
+      </w:r>
+      <w:r>
+        <w:t>https</w:t>
+      </w:r>
+      <w:r>
+        <w:rPr>
+          <w:lang w:val="ru-RU"/>
+        </w:rPr>
+        <w:t>://</w:t>
+      </w:r>
+      <w:proofErr w:type="spellStart"/>
+      <w:r>
+        <w:t>youtu</w:t>
+      </w:r>
+      <w:proofErr w:type="spellEnd"/>
+      <w:r>
+        <w:rPr>
+          <w:lang w:val="ru-RU"/>
+        </w:rPr>
+        <w:t>.</w:t>
+      </w:r>
+      <w:r>
+        <w:t>be</w:t>
+      </w:r>
+      <w:r>
+        <w:rPr>
+          <w:lang w:val="ru-RU"/>
+        </w:rPr>
+        <w:t>/</w:t>
+      </w:r>
+      <w:proofErr w:type="spellStart"/>
+      <w:r>
+        <w:t>UvDYnk</w:t>
+      </w:r>
+      <w:proofErr w:type="spellEnd"/>
+      <w:r>
+        <w:rPr>
+          <w:lang w:val="ru-RU"/>
+        </w:rPr>
+        <w:t>4</w:t>
+      </w:r>
+      <w:r>
+        <w:t>I</w:t>
+      </w:r>
+      <w:r>
+        <w:rPr>
+          <w:lang w:val="ru-RU"/>
+        </w:rPr>
+        <w:t>9</w:t>
+      </w:r>
+      <w:proofErr w:type="spellStart"/>
+      <w:r>
+        <w:t>bg</w:t>
+      </w:r>
+      <w:proofErr w:type="spellEnd"/>
+      <w:r>
+        <w:rPr>
+          <w:lang w:val="ru-RU"/>
+        </w:rPr>
+        <w:t xml:space="preserve">. </w:t>
+      </w:r>
+      <w:r>
+        <w:t>Top</w:t>
+      </w:r>
+      <w:r>
+        <w:rPr>
+          <w:lang w:val="ru-RU"/>
+        </w:rPr>
+        <w:t xml:space="preserve">-1 </w:t>
+      </w:r>
+      <w:r>
+        <w:t>AST</w:t>
+      </w:r>
+      <w:r>
+        <w:rPr>
+          <w:lang w:val="ru-RU"/>
+        </w:rPr>
+        <w:t xml:space="preserve"> (</w:t>
+      </w:r>
+      <w:r>
+        <w:t>https</w:t>
+      </w:r>
+      <w:r>
+        <w:rPr>
+          <w:lang w:val="ru-RU"/>
+        </w:rPr>
+        <w:t>://</w:t>
+      </w:r>
+      <w:proofErr w:type="spellStart"/>
+      <w:r>
+        <w:t>youtu</w:t>
+      </w:r>
+      <w:proofErr w:type="spellEnd"/>
+      <w:r>
+        <w:rPr>
+          <w:lang w:val="ru-RU"/>
+        </w:rPr>
+        <w:t>.</w:t>
+      </w:r>
+      <w:r>
+        <w:t>be</w:t>
+      </w:r>
+      <w:r>
+        <w:rPr>
+          <w:lang w:val="ru-RU"/>
+        </w:rPr>
+        <w:t>/</w:t>
+      </w:r>
+      <w:r>
+        <w:t>Z</w:t>
+      </w:r>
+      <w:r>
+        <w:rPr>
+          <w:lang w:val="ru-RU"/>
+        </w:rPr>
+        <w:t>17</w:t>
+      </w:r>
+      <w:proofErr w:type="spellStart"/>
+      <w:r>
+        <w:t>uXzdDBc</w:t>
+      </w:r>
+      <w:proofErr w:type="spellEnd"/>
+      <w:r>
+        <w:rPr>
+          <w:lang w:val="ru-RU"/>
+        </w:rPr>
+        <w:t>4) получил 2: музыка подходит по энергии и спортивному настроению. Оригинал также получил 2, но занимает только 14-е место. Следовательно, ошибка поиска исходной пары может сопровождаться удачной рекомендацией.</w:t>
+      </w:r>
+    </w:p>
+    <w:p>
+      <w:pPr>
+        <w:rPr>
+          <w:lang w:val="ru-RU"/>
+        </w:rPr>
+      </w:pPr>
+      <w:r>
+        <w:rPr>
+          <w:lang w:val="ru-RU"/>
+        </w:rPr>
+        <w:t xml:space="preserve">Неудачный пример — показ мод </w:t>
+      </w:r>
+      <w:r>
+        <w:t>https</w:t>
+      </w:r>
+      <w:r>
+        <w:rPr>
+          <w:lang w:val="ru-RU"/>
+        </w:rPr>
+        <w:t>://</w:t>
+      </w:r>
+      <w:proofErr w:type="spellStart"/>
+      <w:r>
+        <w:t>youtu</w:t>
+      </w:r>
+      <w:proofErr w:type="spellEnd"/>
+      <w:r>
+        <w:rPr>
+          <w:lang w:val="ru-RU"/>
+        </w:rPr>
+        <w:t>.</w:t>
+      </w:r>
+      <w:r>
+        <w:t>be</w:t>
+      </w:r>
+      <w:r>
+        <w:rPr>
+          <w:lang w:val="ru-RU"/>
+        </w:rPr>
+        <w:t>/_</w:t>
+      </w:r>
+      <w:proofErr w:type="spellStart"/>
+      <w:r>
+        <w:t>BqZgHJI</w:t>
+      </w:r>
+      <w:proofErr w:type="spellEnd"/>
+      <w:r>
+        <w:rPr>
+          <w:lang w:val="ru-RU"/>
+        </w:rPr>
+        <w:t>3</w:t>
+      </w:r>
+      <w:r>
+        <w:t>BU</w:t>
+      </w:r>
+      <w:r>
+        <w:rPr>
+          <w:lang w:val="ru-RU"/>
+        </w:rPr>
+        <w:t xml:space="preserve">. </w:t>
+      </w:r>
+      <w:r>
+        <w:t>Top</w:t>
+      </w:r>
+      <w:r>
+        <w:rPr>
+          <w:lang w:val="ru-RU"/>
+        </w:rPr>
+        <w:t>-1 (</w:t>
+      </w:r>
+      <w:r>
+        <w:t>https</w:t>
+      </w:r>
+      <w:r>
+        <w:rPr>
+          <w:lang w:val="ru-RU"/>
+        </w:rPr>
+        <w:t>://</w:t>
+      </w:r>
+      <w:proofErr w:type="spellStart"/>
+      <w:r>
+        <w:t>youtu</w:t>
+      </w:r>
+      <w:proofErr w:type="spellEnd"/>
+      <w:r>
+        <w:rPr>
+          <w:lang w:val="ru-RU"/>
+        </w:rPr>
+        <w:t>.</w:t>
+      </w:r>
+      <w:r>
+        <w:t>be</w:t>
+      </w:r>
+      <w:r>
+        <w:rPr>
+          <w:lang w:val="ru-RU"/>
+        </w:rPr>
+        <w:t>/9</w:t>
+      </w:r>
+      <w:r>
+        <w:t>L</w:t>
+      </w:r>
+      <w:r>
+        <w:rPr>
+          <w:lang w:val="ru-RU"/>
+        </w:rPr>
+        <w:t>5</w:t>
+      </w:r>
+      <w:proofErr w:type="spellStart"/>
+      <w:r>
+        <w:t>DsAy</w:t>
+      </w:r>
+      <w:proofErr w:type="spellEnd"/>
+      <w:r>
+        <w:rPr>
+          <w:lang w:val="ru-RU"/>
+        </w:rPr>
+        <w:t>56</w:t>
+      </w:r>
+      <w:r>
+        <w:t>AA</w:t>
+      </w:r>
+      <w:r>
+        <w:rPr>
+          <w:lang w:val="ru-RU"/>
+        </w:rPr>
+        <w:t xml:space="preserve">) получил 0 за стилистическое несовпадение, а </w:t>
+      </w:r>
+      <w:r>
+        <w:t>top</w:t>
+      </w:r>
+      <w:r>
+        <w:rPr>
+          <w:lang w:val="ru-RU"/>
+        </w:rPr>
+        <w:t>-2 (</w:t>
+      </w:r>
+      <w:r>
+        <w:t>https</w:t>
+      </w:r>
+      <w:r>
+        <w:rPr>
+          <w:lang w:val="ru-RU"/>
+        </w:rPr>
+        <w:t>://</w:t>
+      </w:r>
+      <w:proofErr w:type="spellStart"/>
+      <w:r>
+        <w:t>youtu</w:t>
+      </w:r>
+      <w:proofErr w:type="spellEnd"/>
+      <w:r>
+        <w:rPr>
+          <w:lang w:val="ru-RU"/>
+        </w:rPr>
+        <w:t>.</w:t>
+      </w:r>
+      <w:r>
+        <w:t>be</w:t>
+      </w:r>
+      <w:r>
+        <w:rPr>
+          <w:lang w:val="ru-RU"/>
+        </w:rPr>
+        <w:t>/</w:t>
+      </w:r>
+      <w:r>
+        <w:t>L</w:t>
+      </w:r>
+      <w:r>
+        <w:rPr>
+          <w:lang w:val="ru-RU"/>
+        </w:rPr>
+        <w:t>402</w:t>
+      </w:r>
+      <w:proofErr w:type="spellStart"/>
+      <w:r>
+        <w:t>imEpzyo</w:t>
+      </w:r>
+      <w:proofErr w:type="spellEnd"/>
+      <w:r>
+        <w:rPr>
+          <w:lang w:val="ru-RU"/>
+        </w:rPr>
+        <w:t xml:space="preserve">) — 2: мотивационная речь и электронная музыка оказались уместны. Оригинал имеет ранг 17 и оценку 2; другая дорожка </w:t>
+      </w:r>
+      <w:proofErr w:type="spellStart"/>
+      <w:r>
+        <w:t>mel</w:t>
+      </w:r>
+      <w:proofErr w:type="spellEnd"/>
+      <w:r>
+        <w:rPr>
+          <w:lang w:val="ru-RU"/>
+        </w:rPr>
+        <w:t>-</w:t>
+      </w:r>
+      <w:r>
+        <w:t>baseline</w:t>
+      </w:r>
+      <w:r>
+        <w:rPr>
+          <w:lang w:val="ru-RU"/>
+        </w:rPr>
+        <w:t xml:space="preserve"> тоже оценена на 2. Для видео существует несколько подходящих вариантов. Запрет любой речи исключил бы один из удачных кандидатов.</w:t>
+      </w:r>
+    </w:p>
+    <w:p>
+      <w:pPr>
+        <w:rPr>
+          <w:lang w:val="ru-RU"/>
+        </w:rPr>
+      </w:pPr>
+      <w:r>
+        <w:rPr>
+          <w:lang w:val="ru-RU"/>
+        </w:rPr>
+        <w:t xml:space="preserve">Обзор коврика </w:t>
+      </w:r>
+      <w:r>
+        <w:t>https</w:t>
+      </w:r>
+      <w:r>
+        <w:rPr>
+          <w:lang w:val="ru-RU"/>
+        </w:rPr>
+        <w:t>://</w:t>
+      </w:r>
+      <w:proofErr w:type="spellStart"/>
+      <w:r>
+        <w:t>youtu</w:t>
+      </w:r>
+      <w:proofErr w:type="spellEnd"/>
+      <w:r>
+        <w:rPr>
+          <w:lang w:val="ru-RU"/>
+        </w:rPr>
+        <w:t>.</w:t>
+      </w:r>
+      <w:r>
+        <w:t>be</w:t>
+      </w:r>
+      <w:r>
+        <w:rPr>
+          <w:lang w:val="ru-RU"/>
+        </w:rPr>
+        <w:t>/</w:t>
+      </w:r>
+      <w:proofErr w:type="spellStart"/>
+      <w:r>
+        <w:t>mLve</w:t>
+      </w:r>
+      <w:proofErr w:type="spellEnd"/>
+      <w:r>
+        <w:rPr>
+          <w:lang w:val="ru-RU"/>
+        </w:rPr>
+        <w:t>0</w:t>
+      </w:r>
+      <w:proofErr w:type="spellStart"/>
+      <w:r>
+        <w:t>fZDFds</w:t>
+      </w:r>
+      <w:proofErr w:type="spellEnd"/>
+      <w:r>
+        <w:rPr>
+          <w:lang w:val="ru-RU"/>
+        </w:rPr>
+        <w:t xml:space="preserve">: все </w:t>
+      </w:r>
+      <w:r>
+        <w:t>top</w:t>
+      </w:r>
+      <w:r>
+        <w:rPr>
+          <w:lang w:val="ru-RU"/>
+        </w:rPr>
+        <w:t xml:space="preserve">-3 </w:t>
+      </w:r>
+      <w:r>
+        <w:t>AST</w:t>
+      </w:r>
+      <w:r>
+        <w:rPr>
+          <w:lang w:val="ru-RU"/>
+        </w:rPr>
+        <w:t xml:space="preserve"> получили 0, исходная дорожка — тоже 0. Для распаковки игрушек </w:t>
+      </w:r>
+      <w:r>
+        <w:t>https</w:t>
+      </w:r>
+      <w:r>
+        <w:rPr>
+          <w:lang w:val="ru-RU"/>
+        </w:rPr>
+        <w:t>://</w:t>
+      </w:r>
+      <w:proofErr w:type="spellStart"/>
+      <w:r>
+        <w:t>youtu</w:t>
+      </w:r>
+      <w:proofErr w:type="spellEnd"/>
+      <w:r>
+        <w:rPr>
+          <w:lang w:val="ru-RU"/>
+        </w:rPr>
+        <w:t>.</w:t>
+      </w:r>
+      <w:r>
+        <w:t>be</w:t>
+      </w:r>
+      <w:r>
+        <w:rPr>
+          <w:lang w:val="ru-RU"/>
+        </w:rPr>
+        <w:t>/</w:t>
+      </w:r>
+      <w:proofErr w:type="spellStart"/>
+      <w:r>
+        <w:t>iRtsyXMGNQo</w:t>
+      </w:r>
+      <w:proofErr w:type="spellEnd"/>
+      <w:r>
+        <w:rPr>
+          <w:lang w:val="ru-RU"/>
+        </w:rPr>
+        <w:t xml:space="preserve"> </w:t>
+      </w:r>
+      <w:r>
+        <w:t>top</w:t>
+      </w:r>
+      <w:r>
+        <w:rPr>
+          <w:lang w:val="ru-RU"/>
+        </w:rPr>
+        <w:t>-1 получил 1, а оригинал — 2. Нужны признаки контекста и динамики, которые теряются при усреднении кадров.</w:t>
+      </w:r>
+    </w:p>
+    <w:p>
+      <w:pPr>
+        <w:rPr>
+          <w:lang w:val="ru-RU"/>
+        </w:rPr>
+      </w:pPr>
+      <w:r>
+        <w:rPr>
+          <w:lang w:val="ru-RU"/>
+        </w:rPr>
+        <w:t xml:space="preserve">Дополнительные примеры: балетный ролик </w:t>
+      </w:r>
+      <w:r>
+        <w:t>https</w:t>
+      </w:r>
+      <w:r>
+        <w:rPr>
+          <w:lang w:val="ru-RU"/>
+        </w:rPr>
+        <w:t>://</w:t>
+      </w:r>
+      <w:proofErr w:type="spellStart"/>
+      <w:r>
+        <w:t>youtu</w:t>
+      </w:r>
+      <w:proofErr w:type="spellEnd"/>
+      <w:r>
+        <w:rPr>
+          <w:lang w:val="ru-RU"/>
+        </w:rPr>
+        <w:t>.</w:t>
+      </w:r>
+      <w:r>
+        <w:t>be</w:t>
+      </w:r>
+      <w:r>
+        <w:rPr>
+          <w:lang w:val="ru-RU"/>
+        </w:rPr>
+        <w:t>/</w:t>
+      </w:r>
+      <w:proofErr w:type="spellStart"/>
+      <w:r>
+        <w:t>bA</w:t>
+      </w:r>
+      <w:proofErr w:type="spellEnd"/>
+      <w:r>
+        <w:rPr>
+          <w:lang w:val="ru-RU"/>
+        </w:rPr>
+        <w:t>5</w:t>
+      </w:r>
+      <w:proofErr w:type="spellStart"/>
+      <w:r>
+        <w:t>ejXkMSLg</w:t>
+      </w:r>
+      <w:proofErr w:type="spellEnd"/>
+      <w:r>
+        <w:rPr>
+          <w:lang w:val="ru-RU"/>
+        </w:rPr>
+        <w:t xml:space="preserve"> — </w:t>
+      </w:r>
+      <w:r>
+        <w:t>top</w:t>
+      </w:r>
+      <w:r>
+        <w:rPr>
+          <w:lang w:val="ru-RU"/>
+        </w:rPr>
+        <w:t xml:space="preserve">-1 </w:t>
+      </w:r>
+      <w:r>
+        <w:t>AST</w:t>
+      </w:r>
+      <w:r>
+        <w:rPr>
+          <w:lang w:val="ru-RU"/>
+        </w:rPr>
+        <w:t xml:space="preserve"> получил 0, а </w:t>
+      </w:r>
+      <w:r>
+        <w:t>top</w:t>
+      </w:r>
+      <w:r>
+        <w:rPr>
+          <w:lang w:val="ru-RU"/>
+        </w:rPr>
+        <w:t xml:space="preserve">-2 и </w:t>
+      </w:r>
+      <w:r>
+        <w:t>top</w:t>
+      </w:r>
+      <w:r>
+        <w:rPr>
+          <w:lang w:val="ru-RU"/>
+        </w:rPr>
+        <w:t xml:space="preserve">-3 — по 2; оригинал получил 2 при ранге 19. Подходящие варианты найдены, но первый кандидат неудачен. Для ролика с рисунком </w:t>
+      </w:r>
+      <w:r>
+        <w:t>https</w:t>
+      </w:r>
+      <w:r>
+        <w:rPr>
+          <w:lang w:val="ru-RU"/>
+        </w:rPr>
+        <w:t>://</w:t>
+      </w:r>
+      <w:proofErr w:type="spellStart"/>
+      <w:r>
+        <w:t>youtu</w:t>
+      </w:r>
+      <w:proofErr w:type="spellEnd"/>
+      <w:r>
+        <w:rPr>
+          <w:lang w:val="ru-RU"/>
+        </w:rPr>
+        <w:t>.</w:t>
+      </w:r>
+      <w:r>
+        <w:t>be</w:t>
+      </w:r>
+      <w:r>
+        <w:rPr>
+          <w:lang w:val="ru-RU"/>
+        </w:rPr>
+        <w:t>/</w:t>
+      </w:r>
+      <w:proofErr w:type="spellStart"/>
+      <w:r>
+        <w:t>MuRlAg</w:t>
+      </w:r>
+      <w:proofErr w:type="spellEnd"/>
+      <w:r>
+        <w:rPr>
+          <w:lang w:val="ru-RU"/>
+        </w:rPr>
+        <w:t>2</w:t>
+      </w:r>
+      <w:proofErr w:type="spellStart"/>
+      <w:r>
+        <w:t>jG</w:t>
+      </w:r>
+      <w:proofErr w:type="spellEnd"/>
+      <w:r>
+        <w:rPr>
+          <w:lang w:val="ru-RU"/>
+        </w:rPr>
+        <w:t>2</w:t>
+      </w:r>
+      <w:r>
+        <w:t>g</w:t>
+      </w:r>
+      <w:r>
+        <w:rPr>
+          <w:lang w:val="ru-RU"/>
+        </w:rPr>
+        <w:t xml:space="preserve"> </w:t>
+      </w:r>
+      <w:r>
+        <w:t>top</w:t>
+      </w:r>
+      <w:r>
+        <w:rPr>
+          <w:lang w:val="ru-RU"/>
+        </w:rPr>
+        <w:t xml:space="preserve">-1 и </w:t>
+      </w:r>
+      <w:r>
+        <w:t>top</w:t>
+      </w:r>
+      <w:r>
+        <w:rPr>
+          <w:lang w:val="ru-RU"/>
+        </w:rPr>
+        <w:t xml:space="preserve">-3 получили 1, </w:t>
+      </w:r>
+      <w:r>
+        <w:t>top</w:t>
+      </w:r>
+      <w:r>
+        <w:rPr>
+          <w:lang w:val="ru-RU"/>
+        </w:rPr>
+        <w:t xml:space="preserve">-2 — 0: речь о сериале не соответствует теме рисунка. Оригинал получил 2 при ранге 6 за </w:t>
+      </w:r>
+      <w:r>
+        <w:rPr>
+          <w:lang w:val="ru-RU"/>
+        </w:rPr>
+        <w:lastRenderedPageBreak/>
+        <w:t>подходящие ритмические акценты. Эти случаи показывают ограничения ранжирования и усреднения признаков.</w:t>
+      </w:r>
+    </w:p>
+    <w:p>
+      <w:pPr>
+        <w:rPr>
+          <w:lang w:val="ru-RU"/>
+        </w:rPr>
+      </w:pPr>
+      <w:r>
+        <w:rPr>
+          <w:lang w:val="ru-RU"/>
+        </w:rPr>
+        <w:t>Ошибки в комментариях относятся к четырём группам: посторонняя разговорная речь; несовпадение энергии и темпа; стилистическое или смысловое несовпадение; неудачная исходная пара. Возможные причины — неоднозначные положительные пары и отсутствие временного сопоставления. Они требуют отдельных проверок. Незнакомый язык и непривычный музыкальный стиль могут снижать личную оценк</w:t>
+      </w:r>
+      <w:r>
+        <w:rPr>
+          <w:lang w:val="ru-RU"/>
+        </w:rPr>
+        <w:t>у</w:t>
+      </w:r>
+      <w:proofErr w:type="gramStart"/>
+      <w:r>
+        <w:rPr>
+          <w:lang w:val="ru-RU"/>
+        </w:rPr>
+        <w:t>.</w:t>
+      </w:r>
+      <w:proofErr w:type="gramEnd"/>
+      <w:r>
+        <w:rPr>
+          <w:lang w:val="ru-RU"/>
+        </w:rPr>
+        <w:t xml:space="preserve"> Э</w:t>
+      </w:r>
+      <w:r>
+        <w:rPr>
+          <w:lang w:val="ru-RU"/>
+        </w:rPr>
+        <w:t xml:space="preserve">то прдпочтение </w:t>
+      </w:r>
+      <w:r>
+        <w:rPr>
+          <w:lang w:val="ru-RU"/>
+        </w:rPr>
+        <w:t xml:space="preserve">меня как </w:t>
+      </w:r>
+      <w:r>
+        <w:rPr>
+          <w:lang w:val="ru-RU"/>
+        </w:rPr>
+        <w:t>оценщика, а не универсальный критерий качества.</w:t>
+      </w:r>
+    </w:p>
+    <w:p>
+      <w:pPr>
+        <w:rPr>
+          <w:lang w:val="ru-RU"/>
+        </w:rPr>
+      </w:pPr>
+      <w:r>
+        <w:rPr>
+          <w:b/>
+          <w:bCs/>
+          <w:lang w:val="ru-RU"/>
+        </w:rPr>
+        <w:t>Вывод:</w:t>
+      </w:r>
+      <w:r>
+        <w:rPr>
+          <w:lang w:val="ru-RU"/>
+        </w:rPr>
+        <w:t xml:space="preserve"> </w:t>
+      </w:r>
+      <w:r>
+        <w:t>AST</w:t>
+      </w:r>
+      <w:r>
+        <w:rPr>
+          <w:lang w:val="ru-RU"/>
+        </w:rPr>
+        <w:t xml:space="preserve"> улучшил восстановление исходной дорожки по сравнению с </w:t>
+      </w:r>
+      <w:proofErr w:type="spellStart"/>
+      <w:r>
+        <w:t>mel</w:t>
+      </w:r>
+      <w:proofErr w:type="spellEnd"/>
+      <w:r>
+        <w:rPr>
+          <w:lang w:val="ru-RU"/>
+        </w:rPr>
+        <w:t xml:space="preserve">. В ручной оценке его средний балл немного выше </w:t>
+      </w:r>
+      <w:r>
+        <w:t>baseline</w:t>
+      </w:r>
+      <w:r>
+        <w:rPr>
+          <w:lang w:val="ru-RU"/>
+        </w:rPr>
+        <w:t xml:space="preserve">, но устойчивое улучшение субъективного подбора не подтверждено. Автоматическая очистка не дала выигрыша. Следующие </w:t>
+      </w:r>
+      <w:proofErr w:type="gramStart"/>
+      <w:r>
+        <w:rPr>
+          <w:lang w:val="ru-RU"/>
+        </w:rPr>
+        <w:t xml:space="preserve">шаги </w:t>
+      </w:r>
+      <w:r>
+        <w:rPr>
+          <w:lang w:val="ru-RU"/>
+        </w:rPr>
+        <w:t>,</w:t>
+      </w:r>
+      <w:proofErr w:type="gramEnd"/>
+      <w:r>
+        <w:rPr>
+          <w:lang w:val="ru-RU"/>
+        </w:rPr>
+        <w:t xml:space="preserve"> которые могут уточнить результаты и добавить основания опровергнуть гипотезу о том, что наша модель AST </w:t>
+      </w:r>
+      <w:r>
+        <w:rPr>
+          <w:lang w:val="ru-RU"/>
+        </w:rPr>
+        <w:t>р</w:t>
+      </w:r>
+      <w:r>
+        <w:rPr>
+          <w:lang w:val="ru-RU"/>
+        </w:rPr>
+        <w:t xml:space="preserve">аботает не лучше </w:t>
+      </w:r>
+      <w:proofErr w:type="spellStart"/>
+      <w:r>
+        <w:rPr>
+          <w:lang w:val="ru-RU"/>
+        </w:rPr>
+        <w:t>рандомного</w:t>
+      </w:r>
+      <w:proofErr w:type="spellEnd"/>
+      <w:r>
+        <w:rPr>
+          <w:lang w:val="ru-RU"/>
+        </w:rPr>
+        <w:t xml:space="preserve"> </w:t>
+      </w:r>
+      <w:r>
+        <w:t>baseline</w:t>
+      </w:r>
+      <w:r>
+        <w:rPr>
+          <w:lang w:val="ru-RU"/>
+        </w:rPr>
+        <w:t xml:space="preserve"> </w:t>
+      </w:r>
+      <w:r>
+        <w:rPr>
+          <w:lang w:val="ru-RU"/>
+        </w:rPr>
+        <w:t xml:space="preserve">— уточнить разметку совместимости, добавить второго оценщика, отдельно учитывать речь и вокал и сохранять динамику видео. Усложнение модели имеет смысл проверять после этого. Оценки не использовались при обучении или выборе </w:t>
+      </w:r>
+      <w:r>
+        <w:t>checkpoint</w:t>
+      </w:r>
+      <w:r>
+        <w:rPr>
+          <w:lang w:val="ru-RU"/>
+        </w:rPr>
+        <w:t xml:space="preserve">. </w:t>
+      </w:r>
+    </w:p>
+    <w:p>
+      <w:pPr>
+        <w:pStyle w:val="Heading1"/>
+        <w:rPr>
+          <w:lang w:val="ru-RU"/>
+        </w:rPr>
+      </w:pPr>
+      <w:r>
+        <w:rPr>
+          <w:lang w:val="ru-RU"/>
+        </w:rPr>
+        <w:t>11. Вывод</w:t>
+      </w:r>
+    </w:p>
+    <w:p>
+      <w:pPr>
+        <w:rPr>
+          <w:lang w:val="ru-RU"/>
+        </w:rPr>
+      </w:pPr>
+      <w:r>
+        <w:rPr>
+          <w:lang w:val="ru-RU"/>
+        </w:rPr>
+        <w:t>В проекте реализован воспроизводимый пайплайн подбора музыки к видео. В дополнительном эксперименте на 380 парах mel-признаки сравнены с предобученным аудиотрансформером AST. На одной тестовой галерее из 49 дорожек средний MRR по трём seed вырос с 0.128 до 0.204, Hit@5 — с 0.136 до 0.259. При этом простой Ridge на признаках AST получил MRR 0.209: преимущество two-tower модели над линейным baseline не подтверждено.</w:t>
+      </w:r>
+      <w:r/>
+      <w:r>
+        <w:rPr>
+          <w:lang w:val="ru-RU"/>
+        </w:rPr>
+      </w:r>
+      <w:r/>
+      <w:r>
+        <w:rPr>
+          <w:lang w:val="ru-RU"/>
+        </w:rPr>
+      </w:r>
+      <w:r>
+        <w:rPr>
+          <w:lang w:val="ru-RU"/>
+        </w:rPr>
+      </w:r>
+      <w:r>
+        <w:rPr>
+          <w:lang w:val="ru-RU"/>
+        </w:rPr>
+      </w:r>
+      <w:r/>
+      <w:r>
+        <w:rPr>
+          <w:lang w:val="ru-RU"/>
+        </w:rPr>
+      </w:r>
+      <w:r/>
+      <w:r>
+        <w:rPr>
+          <w:lang w:val="ru-RU"/>
+        </w:rPr>
+      </w:r>
+      <w:r/>
+      <w:r>
+        <w:rPr>
+          <w:lang w:val="ru-RU"/>
+        </w:rPr>
+      </w:r>
+      <w:r/>
+      <w:r>
+        <w:rPr>
+          <w:lang w:val="ru-RU"/>
+        </w:rPr>
+      </w:r>
+      <w:r/>
+      <w:r>
+        <w:rPr>
+          <w:lang w:val="ru-RU"/>
+        </w:rPr>
+      </w:r>
+    </w:p>
+    <w:p>
+      <w:pPr>
+        <w:rPr>
+          <w:lang w:val="ru-RU"/>
+        </w:rPr>
+      </w:pPr>
+      <w:r>
+        <w:rPr>
+          <w:lang w:val="ru-RU"/>
+        </w:rPr>
+        <w:t>Гипотеза о пользе строгой автоматической очистки в этом эксперименте не подтвердилась. После полной фильтрации осталось 98 обучающих пар, а MRR составил 0.163 — почти столько же, сколько у случайной подвыборки такого размера (0.165). Фильтрация могла исключить полезные примеры вместе с шумными. Это не означает, что очистка данных бесполезна: её правила и качество оставшихся пар требуют ручной проверки.</w:t>
+      </w:r>
+      <w:r/>
+      <w:r>
+        <w:rPr>
+          <w:lang w:val="ru-RU"/>
+        </w:rPr>
+      </w:r>
+      <w:r/>
+      <w:r>
+        <w:rPr>
+          <w:lang w:val="ru-RU"/>
+        </w:rPr>
+      </w:r>
+      <w:proofErr w:type="spellStart"/>
+      <w:r>
+        <w:rPr>
+          <w:lang w:val="ru-RU"/>
+        </w:rPr>
+      </w:r>
+      <w:proofErr w:type="spellEnd"/>
+      <w:r>
+        <w:rPr>
+          <w:lang w:val="ru-RU"/>
+        </w:rPr>
+      </w:r>
+    </w:p>
+    <w:p>
+      <w:pPr>
+        <w:rPr>
+          <w:lang w:val="ru-RU"/>
+        </w:rPr>
+      </w:pPr>
+      <w:r>
+        <w:rPr>
+          <w:lang w:val="ru-RU"/>
+        </w:rPr>
+        <w:t>Ручная оценка 65 пар для семи видео показала средний балл top-3 AST 0.905 против 0.714 у mel и случайного выбора по шкале 0–2. Однако первый кандидат AST получил 0 в четырёх из семи случаев. Небольшая выборка и один оценщик не позволяют считать улучшение совместимости устойчивым. Поиск исходной дорожки и подбор подходящей музыки — разные задачи: низкий ранг оригинала иногда сопровождается удачной рекомендацией, а исходная пара сама может быть неудачной.</w:t>
+      </w:r>
+      <w:proofErr w:type="spellStart"/>
+      <w:r>
+        <w:rPr>
+          <w:lang w:val="ru-RU"/>
+        </w:rPr>
+      </w:r>
+      <w:proofErr w:type="spellEnd"/>
+      <w:r>
+        <w:rPr>
+          <w:lang w:val="ru-RU"/>
+        </w:rPr>
+      </w:r>
+      <w:r/>
+      <w:r>
+        <w:rPr>
+          <w:lang w:val="ru-RU"/>
+        </w:rPr>
+      </w:r>
+      <w:r/>
+      <w:r>
+        <w:rPr>
+          <w:lang w:val="ru-RU"/>
+        </w:rPr>
+      </w:r>
+    </w:p>
+    <w:p>
+      <w:pPr>
+        <w:rPr>
+          <w:lang w:val="ru-RU"/>
+        </w:rPr>
+      </w:pPr>
+      <w:r>
+        <w:rPr>
+          <w:lang w:val="ru-RU"/>
+        </w:rPr>
+        <w:t>Главный результат доработки — проверка архитектуры и фильтрации в сопоставимых условиях и отдельная оценка уместности рекомендаций. Качество ограничивают неоднозначные обучающие пары, посторонняя речь и потеря динамики при усреднении кадров. Следующие шаги — уточнить разметку совместимости, привлечь второго оценщика и отдельно учитывать речь, вокал и временную структуру. При текущем объёме данных эти проверки полезнее дальнейшего усложнения модели.</w:t>
+      </w:r>
+      <w:proofErr w:type="spellStart"/>
+      <w:r>
+        <w:rPr>
+          <w:lang w:val="ru-RU"/>
+        </w:rPr>
+      </w:r>
+      <w:proofErr w:type="spellEnd"/>
+      <w:r>
+        <w:rPr>
+          <w:lang w:val="ru-RU"/>
+        </w:rPr>
+      </w:r>
+      <w:r/>
+      <w:r>
+        <w:rPr>
+          <w:lang w:val="ru-RU"/>
+        </w:rPr>
+      </w:r>
+      <w:r/>
+      <w:r>
+        <w:rPr>
+          <w:lang w:val="ru-RU"/>
+        </w:rPr>
+      </w:r>
     </w:p>
     <w:sectPr>
       <w:pgSz w:w="12240" w:h="15840"/>

</xml_diff>